<commit_message>
Updated for re-formatted quarchpy
git-svn-id: https://quarchserver4.ds.quarch.com/svn/Software/Application%20Notes/AN-017%20-%20QPS%20performance%20test%20with%20FIO/Trunk@2944 265bcc82-57df-11dd-8522-2d0c19f12d9e
</commit_message>
<xml_diff>
--- a/AN-017 - QPS Performance test with FIO.docx
+++ b/AN-017 - QPS Performance test with FIO.docx
@@ -346,12 +346,7 @@
           </w:tcPr>
           <w:p>
             <w:r>
-              <w:t>Updated to Python 3.</w:t>
-            </w:r>
-            <w:bookmarkStart w:id="63" w:name="_GoBack"/>
-            <w:bookmarkEnd w:id="63"/>
-            <w:r>
-              <w:t>x</w:t>
+              <w:t>Updated to Python 3.x</w:t>
             </w:r>
           </w:p>
         </w:tc>
@@ -1390,14 +1385,14 @@
       <w:r>
         <w:br w:type="page"/>
       </w:r>
-      <w:bookmarkStart w:id="64" w:name="_Toc475542641"/>
-      <w:bookmarkStart w:id="65" w:name="_Toc526171865"/>
+      <w:bookmarkStart w:id="63" w:name="_Toc475542641"/>
+      <w:bookmarkStart w:id="64" w:name="_Toc526171865"/>
       <w:r>
         <w:lastRenderedPageBreak/>
         <w:t>Introduction</w:t>
       </w:r>
+      <w:bookmarkEnd w:id="63"/>
       <w:bookmarkEnd w:id="64"/>
-      <w:bookmarkEnd w:id="65"/>
     </w:p>
     <w:p>
       <w:pPr>
@@ -1444,55 +1439,98 @@
       <w:pPr>
         <w:pStyle w:val="Heading1"/>
       </w:pPr>
-      <w:bookmarkStart w:id="66" w:name="_Toc475542642"/>
-      <w:bookmarkStart w:id="67" w:name="_Toc526171866"/>
+      <w:bookmarkStart w:id="65" w:name="_Toc475542642"/>
+      <w:bookmarkStart w:id="66" w:name="_Toc526171866"/>
       <w:r>
         <w:lastRenderedPageBreak/>
         <w:t>Modules Supported</w:t>
       </w:r>
+      <w:bookmarkEnd w:id="65"/>
       <w:bookmarkEnd w:id="66"/>
+    </w:p>
+    <w:p>
+      <w:r>
+        <w:t>XLC power modules</w:t>
+      </w:r>
+    </w:p>
+    <w:p>
+      <w:pPr>
+        <w:pStyle w:val="QBulletlist"/>
+      </w:pPr>
+      <w:r>
+        <w:t>QTL1824 (QTL1824-02A modules do NOT support streaming, but can be upgraded by Quarch)</w:t>
+      </w:r>
+    </w:p>
+    <w:p>
+      <w:pPr>
+        <w:pStyle w:val="QBulletlist"/>
+      </w:pPr>
+      <w:r>
+        <w:t>QTL1847</w:t>
+      </w:r>
+    </w:p>
+    <w:p>
+      <w:r>
+        <w:t>HD power modules</w:t>
+      </w:r>
+    </w:p>
+    <w:p>
+      <w:pPr>
+        <w:pStyle w:val="QBulletlist"/>
+      </w:pPr>
+      <w:r>
+        <w:t>QTL1995</w:t>
+      </w:r>
+    </w:p>
+    <w:p>
+      <w:pPr>
+        <w:pStyle w:val="QBulletlist"/>
+      </w:pPr>
+      <w:r>
+        <w:t>QTL1999</w:t>
+      </w:r>
+    </w:p>
+    <w:p>
+      <w:pPr>
+        <w:spacing w:before="0" w:after="160" w:line="259" w:lineRule="auto"/>
+      </w:pPr>
+    </w:p>
+    <w:p>
+      <w:pPr>
+        <w:pStyle w:val="Heading1"/>
+      </w:pPr>
+      <w:bookmarkStart w:id="67" w:name="_Toc526171867"/>
+      <w:r>
+        <w:t>System</w:t>
+      </w:r>
+      <w:r>
+        <w:t xml:space="preserve"> Supported</w:t>
+      </w:r>
       <w:bookmarkEnd w:id="67"/>
     </w:p>
     <w:p>
       <w:r>
-        <w:t>XLC power modules</w:t>
-      </w:r>
-    </w:p>
-    <w:p>
-      <w:pPr>
-        <w:pStyle w:val="QBulletlist"/>
-      </w:pPr>
-      <w:r>
-        <w:t>QTL1824 (QTL1824-02A modules do NOT support streaming, but can be upgraded by Quarch)</w:t>
-      </w:r>
-    </w:p>
-    <w:p>
-      <w:pPr>
-        <w:pStyle w:val="QBulletlist"/>
-      </w:pPr>
-      <w:r>
-        <w:t>QTL1847</w:t>
-      </w:r>
-    </w:p>
-    <w:p>
-      <w:r>
-        <w:t>HD power modules</w:t>
-      </w:r>
-    </w:p>
-    <w:p>
-      <w:pPr>
-        <w:pStyle w:val="QBulletlist"/>
-      </w:pPr>
-      <w:r>
-        <w:t>QTL1995</w:t>
-      </w:r>
-    </w:p>
-    <w:p>
-      <w:pPr>
-        <w:pStyle w:val="QBulletlist"/>
-      </w:pPr>
-      <w:r>
-        <w:t>QTL1999</w:t>
+        <w:t>This example is written and tested on W</w:t>
+      </w:r>
+      <w:r>
+        <w:t xml:space="preserve">indows, though could </w:t>
+      </w:r>
+      <w:r>
+        <w:t>be used on MacOS and</w:t>
+      </w:r>
+      <w:r>
+        <w:t xml:space="preserve"> Linux </w:t>
+      </w:r>
+      <w:r>
+        <w:t>as long as FIO is installed</w:t>
+      </w:r>
+      <w:r>
+        <w:t>.</w:t>
+      </w:r>
+    </w:p>
+    <w:p>
+      <w:r>
+        <w:t>It currently requires Python 2.x</w:t>
       </w:r>
     </w:p>
     <w:p>
@@ -1502,58 +1540,15 @@
     </w:p>
     <w:p>
       <w:pPr>
-        <w:pStyle w:val="Heading1"/>
-      </w:pPr>
-      <w:bookmarkStart w:id="68" w:name="_Toc526171867"/>
-      <w:r>
-        <w:t>System</w:t>
-      </w:r>
-      <w:r>
-        <w:t xml:space="preserve"> Supported</w:t>
+        <w:pStyle w:val="Heading2"/>
+      </w:pPr>
+      <w:bookmarkStart w:id="68" w:name="_Toc512349227"/>
+      <w:bookmarkStart w:id="69" w:name="_Toc526171868"/>
+      <w:r>
+        <w:t>Application Note Example Files</w:t>
       </w:r>
       <w:bookmarkEnd w:id="68"/>
-    </w:p>
-    <w:p>
-      <w:r>
-        <w:t>This example is written and tested on W</w:t>
-      </w:r>
-      <w:r>
-        <w:t xml:space="preserve">indows, though could </w:t>
-      </w:r>
-      <w:r>
-        <w:t>be used on MacOS and</w:t>
-      </w:r>
-      <w:r>
-        <w:t xml:space="preserve"> Linux </w:t>
-      </w:r>
-      <w:r>
-        <w:t>as long as FIO is installed</w:t>
-      </w:r>
-      <w:r>
-        <w:t>.</w:t>
-      </w:r>
-    </w:p>
-    <w:p>
-      <w:r>
-        <w:t>It currently requires Python 2.x</w:t>
-      </w:r>
-    </w:p>
-    <w:p>
-      <w:pPr>
-        <w:spacing w:before="0" w:after="160" w:line="259" w:lineRule="auto"/>
-      </w:pPr>
-    </w:p>
-    <w:p>
-      <w:pPr>
-        <w:pStyle w:val="Heading2"/>
-      </w:pPr>
-      <w:bookmarkStart w:id="69" w:name="_Toc512349227"/>
-      <w:bookmarkStart w:id="70" w:name="_Toc526171868"/>
-      <w:r>
-        <w:t>Application Note Example Files</w:t>
-      </w:r>
       <w:bookmarkEnd w:id="69"/>
-      <w:bookmarkEnd w:id="70"/>
     </w:p>
     <w:p>
       <w:pPr>
@@ -1710,25 +1705,25 @@
       <w:pPr>
         <w:pStyle w:val="Heading1"/>
       </w:pPr>
-      <w:bookmarkStart w:id="71" w:name="_Toc475542643"/>
-      <w:bookmarkStart w:id="72" w:name="_Toc526171869"/>
+      <w:bookmarkStart w:id="70" w:name="_Toc475542643"/>
+      <w:bookmarkStart w:id="71" w:name="_Toc526171869"/>
       <w:r>
         <w:t>Installation and setup</w:t>
       </w:r>
+      <w:bookmarkEnd w:id="70"/>
       <w:bookmarkEnd w:id="71"/>
+    </w:p>
+    <w:p>
+      <w:pPr>
+        <w:pStyle w:val="Heading2"/>
+      </w:pPr>
+      <w:bookmarkStart w:id="72" w:name="_Toc512349230"/>
+      <w:bookmarkStart w:id="73" w:name="_Toc526171870"/>
+      <w:r>
+        <w:t>Python install</w:t>
+      </w:r>
       <w:bookmarkEnd w:id="72"/>
-    </w:p>
-    <w:p>
-      <w:pPr>
-        <w:pStyle w:val="Heading2"/>
-      </w:pPr>
-      <w:bookmarkStart w:id="73" w:name="_Toc512349230"/>
-      <w:bookmarkStart w:id="74" w:name="_Toc526171870"/>
-      <w:r>
-        <w:t>Python install</w:t>
-      </w:r>
       <w:bookmarkEnd w:id="73"/>
-      <w:bookmarkEnd w:id="74"/>
     </w:p>
     <w:p>
       <w:r>
@@ -1792,8 +1787,8 @@
       <w:pPr>
         <w:pStyle w:val="Heading2"/>
       </w:pPr>
-      <w:bookmarkStart w:id="75" w:name="_Toc512349231"/>
-      <w:bookmarkStart w:id="76" w:name="_Toc526171871"/>
+      <w:bookmarkStart w:id="74" w:name="_Toc512349231"/>
+      <w:bookmarkStart w:id="75" w:name="_Toc526171871"/>
       <w:proofErr w:type="spellStart"/>
       <w:r>
         <w:t>QuarchPy</w:t>
@@ -1802,8 +1797,8 @@
       <w:r>
         <w:t xml:space="preserve"> library install</w:t>
       </w:r>
+      <w:bookmarkEnd w:id="74"/>
       <w:bookmarkEnd w:id="75"/>
-      <w:bookmarkEnd w:id="76"/>
     </w:p>
     <w:p>
       <w:r>
@@ -2038,7 +2033,7 @@
           <w:szCs w:val="26"/>
         </w:rPr>
       </w:pPr>
-      <w:bookmarkStart w:id="77" w:name="_Toc512349233"/>
+      <w:bookmarkStart w:id="76" w:name="_Toc512349233"/>
       <w:r>
         <w:br w:type="page"/>
       </w:r>
@@ -2047,12 +2042,12 @@
       <w:pPr>
         <w:pStyle w:val="Heading2"/>
       </w:pPr>
-      <w:bookmarkStart w:id="78" w:name="_Toc526171872"/>
+      <w:bookmarkStart w:id="77" w:name="_Toc526171872"/>
       <w:r>
         <w:lastRenderedPageBreak/>
         <w:t>Java install</w:t>
       </w:r>
-      <w:bookmarkEnd w:id="78"/>
+      <w:bookmarkEnd w:id="77"/>
     </w:p>
     <w:p>
       <w:pPr>
@@ -2095,11 +2090,11 @@
       <w:pPr>
         <w:pStyle w:val="Heading2"/>
       </w:pPr>
-      <w:bookmarkStart w:id="79" w:name="_Toc526171873"/>
+      <w:bookmarkStart w:id="78" w:name="_Toc526171873"/>
       <w:r>
         <w:t>QPS install</w:t>
       </w:r>
-      <w:bookmarkEnd w:id="79"/>
+      <w:bookmarkEnd w:id="78"/>
     </w:p>
     <w:p>
       <w:pPr>
@@ -2148,11 +2143,11 @@
       <w:pPr>
         <w:pStyle w:val="Heading2"/>
       </w:pPr>
-      <w:bookmarkStart w:id="80" w:name="_Toc526171874"/>
+      <w:bookmarkStart w:id="79" w:name="_Toc526171874"/>
       <w:r>
         <w:t>FIO install</w:t>
       </w:r>
-      <w:bookmarkEnd w:id="80"/>
+      <w:bookmarkEnd w:id="79"/>
     </w:p>
     <w:p>
       <w:proofErr w:type="spellStart"/>
@@ -2198,6 +2193,13 @@
       <w:r>
         <w:t xml:space="preserve">is available in the system’s shell. </w:t>
       </w:r>
+    </w:p>
+    <w:p>
+      <w:r>
+        <w:t>The readme.txt file on the main page lists “Binary Packages” which will be the starting point for most users who do not wish to compile themselves.</w:t>
+      </w:r>
+      <w:bookmarkStart w:id="80" w:name="_GoBack"/>
+      <w:bookmarkEnd w:id="80"/>
     </w:p>
     <w:p/>
     <w:p>
@@ -2806,7 +2808,7 @@
       </w:pPr>
       <w:bookmarkStart w:id="82" w:name="_Toc475542646"/>
       <w:bookmarkStart w:id="83" w:name="_Toc526171876"/>
-      <w:bookmarkEnd w:id="77"/>
+      <w:bookmarkEnd w:id="76"/>
       <w:r>
         <w:lastRenderedPageBreak/>
         <w:t>Running the</w:t>
@@ -4395,6 +4397,7 @@
     <w:lsdException w:name="HTML Sample" w:semiHidden="1" w:unhideWhenUsed="1"/>
     <w:lsdException w:name="HTML Typewriter" w:semiHidden="1" w:unhideWhenUsed="1"/>
     <w:lsdException w:name="HTML Variable" w:semiHidden="1" w:unhideWhenUsed="1"/>
+    <w:lsdException w:name="Normal Table" w:semiHidden="1" w:unhideWhenUsed="1"/>
     <w:lsdException w:name="annotation subject" w:semiHidden="1" w:unhideWhenUsed="1"/>
     <w:lsdException w:name="No List" w:semiHidden="1" w:unhideWhenUsed="1"/>
     <w:lsdException w:name="Outline List 1" w:semiHidden="1" w:unhideWhenUsed="1"/>
@@ -4438,8 +4441,10 @@
     <w:lsdException w:name="Table Elegant" w:semiHidden="1" w:unhideWhenUsed="1"/>
     <w:lsdException w:name="Table Professional" w:semiHidden="1" w:unhideWhenUsed="1"/>
     <w:lsdException w:name="Table Subtle 1" w:semiHidden="1" w:unhideWhenUsed="1"/>
+    <w:lsdException w:name="Table Subtle 2" w:semiHidden="1" w:unhideWhenUsed="1"/>
     <w:lsdException w:name="Table Web 1" w:semiHidden="1" w:unhideWhenUsed="1"/>
     <w:lsdException w:name="Table Web 2" w:semiHidden="1" w:unhideWhenUsed="1"/>
+    <w:lsdException w:name="Table Web 3" w:semiHidden="1" w:unhideWhenUsed="1"/>
     <w:lsdException w:name="Balloon Text" w:semiHidden="1" w:unhideWhenUsed="1"/>
     <w:lsdException w:name="Table Grid" w:uiPriority="0"/>
     <w:lsdException w:name="Table Theme" w:semiHidden="1" w:unhideWhenUsed="1"/>
@@ -5832,6 +5837,18 @@
     <w:rPr>
       <w:color w:val="808080"/>
       <w:shd w:val="clear" w:color="auto" w:fill="E6E6E6"/>
+    </w:rPr>
+  </w:style>
+  <w:style w:type="character" w:styleId="FollowedHyperlink">
+    <w:name w:val="FollowedHyperlink"/>
+    <w:basedOn w:val="DefaultParagraphFont"/>
+    <w:uiPriority w:val="99"/>
+    <w:semiHidden/>
+    <w:unhideWhenUsed/>
+    <w:rsid w:val="00FA4456"/>
+    <w:rPr>
+      <w:color w:val="954F72" w:themeColor="followedHyperlink"/>
+      <w:u w:val="single"/>
     </w:rPr>
   </w:style>
 </w:styles>
@@ -6103,7 +6120,7 @@
 </file>
 
 <file path=customXml/itemProps1.xml><?xml version="1.0" encoding="utf-8"?>
-<ds:datastoreItem xmlns:ds="http://schemas.openxmlformats.org/officeDocument/2006/customXml" ds:itemID="{21F4E00F-E1C0-4395-B9A8-B5EA13FB493A}">
+<ds:datastoreItem xmlns:ds="http://schemas.openxmlformats.org/officeDocument/2006/customXml" ds:itemID="{3A5A41BF-F860-4026-B470-62FEBE57EEFC}">
   <ds:schemaRefs>
     <ds:schemaRef ds:uri="http://schemas.openxmlformats.org/officeDocument/2006/bibliography"/>
   </ds:schemaRefs>

</xml_diff>

<commit_message>
updated documentation for version 1.2
git-svn-id: https://quarchserver4.ds.quarch.com/svn/Software/Application%20Notes/AN-017%20-%20QPS%20performance%20test%20with%20FIO/Trunk@3044 265bcc82-57df-11dd-8522-2d0c19f12d9e
</commit_message>
<xml_diff>
--- a/AN-017 - QPS Performance test with FIO.docx
+++ b/AN-017 - QPS Performance test with FIO.docx
@@ -179,9 +179,11 @@
       <w:pPr>
         <w:pStyle w:val="Centredimage"/>
       </w:pPr>
+      <w:bookmarkStart w:id="44" w:name="_GoBack"/>
+      <w:bookmarkEnd w:id="44"/>
       <w:r>
         <w:drawing>
-          <wp:inline distT="0" distB="0" distL="0" distR="0" wp14:anchorId="456434D7" wp14:editId="304BE563">
+          <wp:inline distT="0" distB="0" distL="0" distR="0" wp14:anchorId="56311F47" wp14:editId="3589D683">
             <wp:extent cx="3695994" cy="1905746"/>
             <wp:effectExtent l="0" t="0" r="0" b="0"/>
             <wp:docPr id="85" name="Picture 1"/>
@@ -226,34 +228,33 @@
       <w:pPr>
         <w:pStyle w:val="Heading1"/>
       </w:pPr>
-      <w:bookmarkStart w:id="44" w:name="_Toc260389311"/>
-      <w:bookmarkStart w:id="45" w:name="_Toc262028175"/>
-      <w:bookmarkStart w:id="46" w:name="_Toc262029014"/>
-      <w:bookmarkStart w:id="47" w:name="_Toc262048129"/>
-      <w:bookmarkStart w:id="48" w:name="_Toc262048517"/>
-      <w:bookmarkStart w:id="49" w:name="_Toc262048569"/>
-      <w:bookmarkStart w:id="50" w:name="_Toc276715494"/>
-      <w:bookmarkStart w:id="51" w:name="_Toc276715534"/>
-      <w:bookmarkStart w:id="52" w:name="_Toc276716140"/>
-      <w:bookmarkStart w:id="53" w:name="_Toc276720080"/>
-      <w:bookmarkStart w:id="54" w:name="_Toc277602561"/>
+      <w:bookmarkStart w:id="45" w:name="_Toc260389311"/>
+      <w:bookmarkStart w:id="46" w:name="_Toc262028175"/>
+      <w:bookmarkStart w:id="47" w:name="_Toc262029014"/>
+      <w:bookmarkStart w:id="48" w:name="_Toc262048129"/>
+      <w:bookmarkStart w:id="49" w:name="_Toc262048517"/>
+      <w:bookmarkStart w:id="50" w:name="_Toc262048569"/>
+      <w:bookmarkStart w:id="51" w:name="_Toc276715494"/>
+      <w:bookmarkStart w:id="52" w:name="_Toc276715534"/>
+      <w:bookmarkStart w:id="53" w:name="_Toc276716140"/>
+      <w:bookmarkStart w:id="54" w:name="_Toc276720080"/>
+      <w:bookmarkStart w:id="55" w:name="_Toc277602561"/>
       <w:bookmarkEnd w:id="37"/>
       <w:r>
         <w:br w:type="page"/>
       </w:r>
-      <w:bookmarkStart w:id="55" w:name="_Toc359856653"/>
-      <w:bookmarkStart w:id="56" w:name="_Toc362960378"/>
-      <w:bookmarkStart w:id="57" w:name="_Toc372718893"/>
-      <w:bookmarkStart w:id="58" w:name="_Toc372718921"/>
-      <w:bookmarkStart w:id="59" w:name="_Toc372718985"/>
-      <w:bookmarkStart w:id="60" w:name="_Toc372720479"/>
-      <w:bookmarkStart w:id="61" w:name="_Toc465168329"/>
-      <w:bookmarkStart w:id="62" w:name="_Toc526171864"/>
+      <w:bookmarkStart w:id="56" w:name="_Toc359856653"/>
+      <w:bookmarkStart w:id="57" w:name="_Toc362960378"/>
+      <w:bookmarkStart w:id="58" w:name="_Toc372718893"/>
+      <w:bookmarkStart w:id="59" w:name="_Toc372718921"/>
+      <w:bookmarkStart w:id="60" w:name="_Toc372718985"/>
+      <w:bookmarkStart w:id="61" w:name="_Toc372720479"/>
+      <w:bookmarkStart w:id="62" w:name="_Toc465168329"/>
+      <w:bookmarkStart w:id="63" w:name="_Toc526171864"/>
       <w:r>
         <w:lastRenderedPageBreak/>
         <w:t>Change History</w:t>
       </w:r>
-      <w:bookmarkEnd w:id="44"/>
       <w:bookmarkEnd w:id="45"/>
       <w:bookmarkEnd w:id="46"/>
       <w:bookmarkEnd w:id="47"/>
@@ -272,6 +273,7 @@
       <w:bookmarkEnd w:id="60"/>
       <w:bookmarkEnd w:id="61"/>
       <w:bookmarkEnd w:id="62"/>
+      <w:bookmarkEnd w:id="63"/>
     </w:p>
     <w:tbl>
       <w:tblPr>
@@ -287,9 +289,9 @@
         <w:tblLook w:val="04A0" w:firstRow="1" w:lastRow="0" w:firstColumn="1" w:lastColumn="0" w:noHBand="0" w:noVBand="1"/>
       </w:tblPr>
       <w:tblGrid>
-        <w:gridCol w:w="993"/>
+        <w:gridCol w:w="992"/>
         <w:gridCol w:w="2592"/>
-        <w:gridCol w:w="5431"/>
+        <w:gridCol w:w="5432"/>
       </w:tblGrid>
       <w:tr>
         <w:tc>
@@ -325,9 +327,11 @@
             <w:tcW w:w="993" w:type="dxa"/>
           </w:tcPr>
           <w:p>
-            <w:r>
-              <w:t>1.1</w:t>
-            </w:r>
+            <w:ins w:id="64" w:author="Comparison" w:date="2019-05-09T12:34:00Z">
+              <w:r>
+                <w:t>1.1</w:t>
+              </w:r>
+            </w:ins>
           </w:p>
         </w:tc>
         <w:tc>
@@ -335,9 +339,11 @@
             <w:tcW w:w="2595" w:type="dxa"/>
           </w:tcPr>
           <w:p>
-            <w:r>
-              <w:t>Feb 2019</w:t>
-            </w:r>
+            <w:ins w:id="65" w:author="Comparison" w:date="2019-05-09T12:34:00Z">
+              <w:r>
+                <w:t>Feb 2019</w:t>
+              </w:r>
+            </w:ins>
           </w:p>
         </w:tc>
         <w:tc>
@@ -345,9 +351,11 @@
             <w:tcW w:w="5438" w:type="dxa"/>
           </w:tcPr>
           <w:p>
-            <w:r>
-              <w:t>Updated to Python 3.x</w:t>
-            </w:r>
+            <w:ins w:id="66" w:author="Comparison" w:date="2019-05-09T12:34:00Z">
+              <w:r>
+                <w:t>Updated to Python 3.x</w:t>
+              </w:r>
+            </w:ins>
           </w:p>
         </w:tc>
       </w:tr>
@@ -356,19 +364,39 @@
           <w:tcPr>
             <w:tcW w:w="993" w:type="dxa"/>
           </w:tcPr>
-          <w:p/>
+          <w:p>
+            <w:r>
+              <w:t>1.2</w:t>
+            </w:r>
+          </w:p>
         </w:tc>
         <w:tc>
           <w:tcPr>
             <w:tcW w:w="2595" w:type="dxa"/>
           </w:tcPr>
-          <w:p/>
+          <w:p>
+            <w:r>
+              <w:t>May 2019</w:t>
+            </w:r>
+          </w:p>
         </w:tc>
         <w:tc>
           <w:tcPr>
             <w:tcW w:w="5438" w:type="dxa"/>
           </w:tcPr>
-          <w:p/>
+          <w:p>
+            <w:r>
+              <w:t xml:space="preserve">Updated for </w:t>
+            </w:r>
+            <w:proofErr w:type="spellStart"/>
+            <w:r>
+              <w:t>quarchpy</w:t>
+            </w:r>
+            <w:proofErr w:type="spellEnd"/>
+            <w:r>
+              <w:t xml:space="preserve"> 2.x</w:t>
+            </w:r>
+          </w:p>
         </w:tc>
       </w:tr>
       <w:tr>
@@ -1385,14 +1413,14 @@
       <w:r>
         <w:br w:type="page"/>
       </w:r>
-      <w:bookmarkStart w:id="63" w:name="_Toc475542641"/>
-      <w:bookmarkStart w:id="64" w:name="_Toc526171865"/>
+      <w:bookmarkStart w:id="67" w:name="_Toc475542641"/>
+      <w:bookmarkStart w:id="68" w:name="_Toc526171865"/>
       <w:r>
         <w:lastRenderedPageBreak/>
         <w:t>Introduction</w:t>
       </w:r>
-      <w:bookmarkEnd w:id="63"/>
-      <w:bookmarkEnd w:id="64"/>
+      <w:bookmarkEnd w:id="67"/>
+      <w:bookmarkEnd w:id="68"/>
     </w:p>
     <w:p>
       <w:pPr>
@@ -1439,14 +1467,14 @@
       <w:pPr>
         <w:pStyle w:val="Heading1"/>
       </w:pPr>
-      <w:bookmarkStart w:id="65" w:name="_Toc475542642"/>
-      <w:bookmarkStart w:id="66" w:name="_Toc526171866"/>
+      <w:bookmarkStart w:id="69" w:name="_Toc475542642"/>
+      <w:bookmarkStart w:id="70" w:name="_Toc526171866"/>
       <w:r>
         <w:lastRenderedPageBreak/>
         <w:t>Modules Supported</w:t>
       </w:r>
-      <w:bookmarkEnd w:id="65"/>
-      <w:bookmarkEnd w:id="66"/>
+      <w:bookmarkEnd w:id="69"/>
+      <w:bookmarkEnd w:id="70"/>
     </w:p>
     <w:p>
       <w:r>
@@ -1499,14 +1527,14 @@
       <w:pPr>
         <w:pStyle w:val="Heading1"/>
       </w:pPr>
-      <w:bookmarkStart w:id="67" w:name="_Toc526171867"/>
+      <w:bookmarkStart w:id="71" w:name="_Toc526171867"/>
       <w:r>
         <w:t>System</w:t>
       </w:r>
       <w:r>
         <w:t xml:space="preserve"> Supported</w:t>
       </w:r>
-      <w:bookmarkEnd w:id="67"/>
+      <w:bookmarkEnd w:id="71"/>
     </w:p>
     <w:p>
       <w:r>
@@ -1530,7 +1558,13 @@
     </w:p>
     <w:p>
       <w:r>
-        <w:t>It currently requires Python 2.x</w:t>
+        <w:t xml:space="preserve">It currently requires Python </w:t>
+      </w:r>
+      <w:r>
+        <w:t>3</w:t>
+      </w:r>
+      <w:r>
+        <w:t>.x</w:t>
       </w:r>
     </w:p>
     <w:p>
@@ -1542,13 +1576,13 @@
       <w:pPr>
         <w:pStyle w:val="Heading2"/>
       </w:pPr>
-      <w:bookmarkStart w:id="68" w:name="_Toc512349227"/>
-      <w:bookmarkStart w:id="69" w:name="_Toc526171868"/>
+      <w:bookmarkStart w:id="72" w:name="_Toc512349227"/>
+      <w:bookmarkStart w:id="73" w:name="_Toc526171868"/>
       <w:r>
         <w:t>Application Note Example Files</w:t>
       </w:r>
-      <w:bookmarkEnd w:id="68"/>
-      <w:bookmarkEnd w:id="69"/>
+      <w:bookmarkEnd w:id="72"/>
+      <w:bookmarkEnd w:id="73"/>
     </w:p>
     <w:p>
       <w:pPr>
@@ -1705,29 +1739,35 @@
       <w:pPr>
         <w:pStyle w:val="Heading1"/>
       </w:pPr>
-      <w:bookmarkStart w:id="70" w:name="_Toc475542643"/>
-      <w:bookmarkStart w:id="71" w:name="_Toc526171869"/>
+      <w:bookmarkStart w:id="74" w:name="_Toc475542643"/>
+      <w:bookmarkStart w:id="75" w:name="_Toc526171869"/>
       <w:r>
         <w:t>Installation and setup</w:t>
       </w:r>
-      <w:bookmarkEnd w:id="70"/>
-      <w:bookmarkEnd w:id="71"/>
+      <w:bookmarkEnd w:id="74"/>
+      <w:bookmarkEnd w:id="75"/>
     </w:p>
     <w:p>
       <w:pPr>
         <w:pStyle w:val="Heading2"/>
       </w:pPr>
-      <w:bookmarkStart w:id="72" w:name="_Toc512349230"/>
-      <w:bookmarkStart w:id="73" w:name="_Toc526171870"/>
+      <w:bookmarkStart w:id="76" w:name="_Toc512349230"/>
+      <w:bookmarkStart w:id="77" w:name="_Toc526171870"/>
       <w:r>
         <w:t>Python install</w:t>
       </w:r>
-      <w:bookmarkEnd w:id="72"/>
-      <w:bookmarkEnd w:id="73"/>
-    </w:p>
-    <w:p>
-      <w:r>
-        <w:t>If you do not already have Python installed, download and install it from:</w:t>
+      <w:bookmarkEnd w:id="76"/>
+      <w:bookmarkEnd w:id="77"/>
+    </w:p>
+    <w:p>
+      <w:r>
+        <w:t xml:space="preserve">If you do not already have Python </w:t>
+      </w:r>
+      <w:r>
+        <w:t xml:space="preserve">3.x </w:t>
+      </w:r>
+      <w:r>
+        <w:t>installed, download and install it from:</w:t>
       </w:r>
     </w:p>
     <w:p>
@@ -1773,22 +1813,74 @@
         <w:t>:</w:t>
       </w:r>
     </w:p>
-    <w:p>
-      <w:hyperlink r:id="rId10" w:anchor="excursus-setting-environment-variables" w:history="1">
-        <w:r>
-          <w:rPr>
-            <w:rStyle w:val="Hyperlink"/>
-          </w:rPr>
-          <w:t>https://docs.python.org/2/using/windows.html#excursus-setting-environment-variables</w:t>
-        </w:r>
-      </w:hyperlink>
-    </w:p>
+    <w:bookmarkStart w:id="78" w:name="_Toc512349231"/>
+    <w:bookmarkStart w:id="79" w:name="_Toc526171871"/>
     <w:p>
       <w:pPr>
         <w:pStyle w:val="Heading2"/>
-      </w:pPr>
-      <w:bookmarkStart w:id="74" w:name="_Toc512349231"/>
-      <w:bookmarkStart w:id="75" w:name="_Toc526171871"/>
+        <w:rPr>
+          <w:rFonts w:eastAsiaTheme="minorHAnsi" w:cstheme="minorBidi"/>
+          <w:b w:val="0"/>
+          <w:color w:val="000000" w:themeColor="text1"/>
+          <w:sz w:val="24"/>
+          <w:szCs w:val="22"/>
+        </w:rPr>
+      </w:pPr>
+      <w:r>
+        <w:rPr>
+          <w:rFonts w:eastAsiaTheme="minorHAnsi" w:cstheme="minorBidi"/>
+          <w:b w:val="0"/>
+          <w:color w:val="000000" w:themeColor="text1"/>
+          <w:sz w:val="24"/>
+          <w:szCs w:val="22"/>
+        </w:rPr>
+        <w:lastRenderedPageBreak/>
+        <w:fldChar w:fldCharType="begin"/>
+      </w:r>
+      <w:r>
+        <w:rPr>
+          <w:rFonts w:eastAsiaTheme="minorHAnsi" w:cstheme="minorBidi"/>
+          <w:b w:val="0"/>
+          <w:color w:val="000000" w:themeColor="text1"/>
+          <w:sz w:val="24"/>
+          <w:szCs w:val="22"/>
+        </w:rPr>
+        <w:instrText xml:space="preserve"> HYPERLINK "https://docs.python.org/3/using/windows.html" \l "excursus-setting-environment-variables" </w:instrText>
+      </w:r>
+      <w:r>
+        <w:rPr>
+          <w:rFonts w:eastAsiaTheme="minorHAnsi" w:cstheme="minorBidi"/>
+          <w:b w:val="0"/>
+          <w:color w:val="000000" w:themeColor="text1"/>
+          <w:sz w:val="24"/>
+          <w:szCs w:val="22"/>
+        </w:rPr>
+        <w:fldChar w:fldCharType="separate"/>
+      </w:r>
+      <w:r>
+        <w:rPr>
+          <w:rStyle w:val="Hyperlink"/>
+          <w:rFonts w:eastAsiaTheme="minorHAnsi" w:cstheme="minorBidi"/>
+          <w:b w:val="0"/>
+          <w:szCs w:val="22"/>
+        </w:rPr>
+        <w:t>https://docs.python.org/3/using/windows.html#excursus-setting-environment-variables</w:t>
+      </w:r>
+      <w:r>
+        <w:rPr>
+          <w:rFonts w:eastAsiaTheme="minorHAnsi" w:cstheme="minorBidi"/>
+          <w:b w:val="0"/>
+          <w:color w:val="000000" w:themeColor="text1"/>
+          <w:sz w:val="24"/>
+          <w:szCs w:val="22"/>
+        </w:rPr>
+        <w:fldChar w:fldCharType="end"/>
+      </w:r>
+    </w:p>
+    <w:p>
+      <w:pPr>
+        <w:pStyle w:val="Heading2"/>
+      </w:pPr>
       <w:proofErr w:type="spellStart"/>
       <w:r>
         <w:t>QuarchPy</w:t>
@@ -1797,8 +1889,8 @@
       <w:r>
         <w:t xml:space="preserve"> library install</w:t>
       </w:r>
-      <w:bookmarkEnd w:id="74"/>
-      <w:bookmarkEnd w:id="75"/>
+      <w:bookmarkEnd w:id="78"/>
+      <w:bookmarkEnd w:id="79"/>
     </w:p>
     <w:p>
       <w:r>
@@ -1987,7 +2079,7 @@
       </w:r>
       <w:proofErr w:type="spellEnd"/>
       <w:r>
-        <w:t xml:space="preserve"> installed, you will get a failure message.  If you want to upgrade to a new version, you need to add the ‘--upgrade’ command:</w:t>
+        <w:t xml:space="preserve"> installed, you will get a failure message. If you want to upgrade to a new version, you need to add the ‘--upgrade’ command:</w:t>
       </w:r>
     </w:p>
     <w:p>
@@ -2033,7 +2125,7 @@
           <w:szCs w:val="26"/>
         </w:rPr>
       </w:pPr>
-      <w:bookmarkStart w:id="76" w:name="_Toc512349233"/>
+      <w:bookmarkStart w:id="80" w:name="_Toc512349233"/>
       <w:r>
         <w:br w:type="page"/>
       </w:r>
@@ -2042,12 +2134,12 @@
       <w:pPr>
         <w:pStyle w:val="Heading2"/>
       </w:pPr>
-      <w:bookmarkStart w:id="77" w:name="_Toc526171872"/>
+      <w:bookmarkStart w:id="81" w:name="_Toc526171872"/>
       <w:r>
         <w:lastRenderedPageBreak/>
         <w:t>Java install</w:t>
       </w:r>
-      <w:bookmarkEnd w:id="77"/>
+      <w:bookmarkEnd w:id="81"/>
     </w:p>
     <w:p>
       <w:pPr>
@@ -2072,7 +2164,7 @@
       <w:r>
         <w:br/>
       </w:r>
-      <w:hyperlink r:id="rId11" w:history="1">
+      <w:hyperlink r:id="rId10" w:history="1">
         <w:r>
           <w:rPr>
             <w:rStyle w:val="Hyperlink"/>
@@ -2090,11 +2182,11 @@
       <w:pPr>
         <w:pStyle w:val="Heading2"/>
       </w:pPr>
-      <w:bookmarkStart w:id="78" w:name="_Toc526171873"/>
+      <w:bookmarkStart w:id="82" w:name="_Toc526171873"/>
       <w:r>
         <w:t>QPS install</w:t>
       </w:r>
-      <w:bookmarkEnd w:id="78"/>
+      <w:bookmarkEnd w:id="82"/>
     </w:p>
     <w:p>
       <w:pPr>
@@ -2122,7 +2214,7 @@
       <w:r>
         <w:br/>
       </w:r>
-      <w:hyperlink r:id="rId12" w:history="1">
+      <w:hyperlink r:id="rId11" w:history="1">
         <w:r>
           <w:rPr>
             <w:rStyle w:val="Hyperlink"/>
@@ -2143,11 +2235,11 @@
       <w:pPr>
         <w:pStyle w:val="Heading2"/>
       </w:pPr>
-      <w:bookmarkStart w:id="79" w:name="_Toc526171874"/>
+      <w:bookmarkStart w:id="83" w:name="_Toc526171874"/>
       <w:r>
         <w:t>FIO install</w:t>
       </w:r>
-      <w:bookmarkEnd w:id="79"/>
+      <w:bookmarkEnd w:id="83"/>
     </w:p>
     <w:p>
       <w:proofErr w:type="spellStart"/>
@@ -2158,7 +2250,7 @@
       <w:r>
         <w:t xml:space="preserve"> doesn’t ship with FIO. Follow the installation procedures described in </w:t>
       </w:r>
-      <w:hyperlink r:id="rId13" w:history="1">
+      <w:hyperlink r:id="rId12" w:history="1">
         <w:r>
           <w:rPr>
             <w:rStyle w:val="Hyperlink"/>
@@ -2194,13 +2286,6 @@
         <w:t xml:space="preserve">is available in the system’s shell. </w:t>
       </w:r>
     </w:p>
-    <w:p>
-      <w:r>
-        <w:t>The readme.txt file on the main page lists “Binary Packages” which will be the starting point for most users who do not wish to compile themselves.</w:t>
-      </w:r>
-      <w:bookmarkStart w:id="80" w:name="_GoBack"/>
-      <w:bookmarkEnd w:id="80"/>
-    </w:p>
     <w:p/>
     <w:p>
       <w:pPr>
@@ -2247,12 +2332,12 @@
       <w:pPr>
         <w:pStyle w:val="Heading2"/>
       </w:pPr>
-      <w:bookmarkStart w:id="81" w:name="_Toc526171875"/>
+      <w:bookmarkStart w:id="84" w:name="_Toc526171875"/>
       <w:r>
         <w:lastRenderedPageBreak/>
         <w:t>Power module setup</w:t>
       </w:r>
-      <w:bookmarkEnd w:id="81"/>
+      <w:bookmarkEnd w:id="84"/>
     </w:p>
     <w:p>
       <w:r>
@@ -2276,7 +2361,7 @@
         <mc:AlternateContent>
           <mc:Choice Requires="wps">
             <w:drawing>
-              <wp:anchor distT="0" distB="0" distL="114300" distR="114300" simplePos="0" relativeHeight="251664384" behindDoc="0" locked="0" layoutInCell="1" allowOverlap="1" wp14:anchorId="6AABD32A" wp14:editId="5CD0E80B">
+              <wp:anchor distT="0" distB="0" distL="114300" distR="114300" simplePos="0" relativeHeight="251664384" behindDoc="0" locked="0" layoutInCell="1" allowOverlap="1" wp14:anchorId="03F732C4" wp14:editId="3D632E25">
                 <wp:simplePos x="0" y="0"/>
                 <wp:positionH relativeFrom="column">
                   <wp:posOffset>2004060</wp:posOffset>
@@ -2346,7 +2431,7 @@
         <mc:AlternateContent>
           <mc:Choice Requires="wps">
             <w:drawing>
-              <wp:anchor distT="0" distB="0" distL="114300" distR="114300" simplePos="0" relativeHeight="251660288" behindDoc="0" locked="0" layoutInCell="1" allowOverlap="1" wp14:anchorId="5562DC84" wp14:editId="4CB28AB8">
+              <wp:anchor distT="0" distB="0" distL="114300" distR="114300" simplePos="0" relativeHeight="251660288" behindDoc="0" locked="0" layoutInCell="1" allowOverlap="1" wp14:anchorId="20EE09F9" wp14:editId="670168B3">
                 <wp:simplePos x="0" y="0"/>
                 <wp:positionH relativeFrom="column">
                   <wp:posOffset>1242060</wp:posOffset>
@@ -2441,7 +2526,7 @@
         <mc:AlternateContent>
           <mc:Choice Requires="wps">
             <w:drawing>
-              <wp:anchor distT="45720" distB="45720" distL="114300" distR="114300" simplePos="0" relativeHeight="251663360" behindDoc="0" locked="0" layoutInCell="1" allowOverlap="1" wp14:anchorId="78809BB8" wp14:editId="78E2CABD">
+              <wp:anchor distT="45720" distB="45720" distL="114300" distR="114300" simplePos="0" relativeHeight="251663360" behindDoc="0" locked="0" layoutInCell="1" allowOverlap="1" wp14:anchorId="3C1A93AA" wp14:editId="629FA52A">
                 <wp:simplePos x="0" y="0"/>
                 <wp:positionH relativeFrom="margin">
                   <wp:posOffset>2049780</wp:posOffset>
@@ -2550,7 +2635,7 @@
         <mc:AlternateContent>
           <mc:Choice Requires="wps">
             <w:drawing>
-              <wp:anchor distT="0" distB="0" distL="114300" distR="114300" simplePos="0" relativeHeight="251662336" behindDoc="0" locked="0" layoutInCell="1" allowOverlap="1" wp14:anchorId="2F88C041" wp14:editId="2C444060">
+              <wp:anchor distT="0" distB="0" distL="114300" distR="114300" simplePos="0" relativeHeight="251662336" behindDoc="0" locked="0" layoutInCell="1" allowOverlap="1" wp14:anchorId="2190363E" wp14:editId="347DB746">
                 <wp:simplePos x="0" y="0"/>
                 <wp:positionH relativeFrom="column">
                   <wp:posOffset>1996440</wp:posOffset>
@@ -2614,7 +2699,7 @@
         <mc:AlternateContent>
           <mc:Choice Requires="wps">
             <w:drawing>
-              <wp:anchor distT="0" distB="0" distL="114300" distR="114300" simplePos="0" relativeHeight="251659264" behindDoc="0" locked="0" layoutInCell="1" allowOverlap="1" wp14:anchorId="516676A5" wp14:editId="62E274A0">
+              <wp:anchor distT="0" distB="0" distL="114300" distR="114300" simplePos="0" relativeHeight="251659264" behindDoc="0" locked="0" layoutInCell="1" allowOverlap="1" wp14:anchorId="55ECCE99" wp14:editId="78BE9912">
                 <wp:simplePos x="0" y="0"/>
                 <wp:positionH relativeFrom="column">
                   <wp:posOffset>1233805</wp:posOffset>
@@ -2711,7 +2796,7 @@
         <mc:AlternateContent>
           <mc:Choice Requires="wps">
             <w:drawing>
-              <wp:anchor distT="0" distB="0" distL="114300" distR="114300" simplePos="0" relativeHeight="251661312" behindDoc="0" locked="0" layoutInCell="1" allowOverlap="1" wp14:anchorId="24A1126A" wp14:editId="524C42C0">
+              <wp:anchor distT="0" distB="0" distL="114300" distR="114300" simplePos="0" relativeHeight="251661312" behindDoc="0" locked="0" layoutInCell="1" allowOverlap="1" wp14:anchorId="43035168" wp14:editId="7156E502">
                 <wp:simplePos x="0" y="0"/>
                 <wp:positionH relativeFrom="column">
                   <wp:posOffset>1234440</wp:posOffset>
@@ -2806,9 +2891,9 @@
       <w:pPr>
         <w:pStyle w:val="Heading1"/>
       </w:pPr>
-      <w:bookmarkStart w:id="82" w:name="_Toc475542646"/>
-      <w:bookmarkStart w:id="83" w:name="_Toc526171876"/>
-      <w:bookmarkEnd w:id="76"/>
+      <w:bookmarkStart w:id="85" w:name="_Toc475542646"/>
+      <w:bookmarkStart w:id="86" w:name="_Toc526171876"/>
+      <w:bookmarkEnd w:id="80"/>
       <w:r>
         <w:lastRenderedPageBreak/>
         <w:t>Running the</w:t>
@@ -2822,8 +2907,8 @@
       <w:r>
         <w:t>xample</w:t>
       </w:r>
-      <w:bookmarkEnd w:id="82"/>
-      <w:bookmarkEnd w:id="83"/>
+      <w:bookmarkEnd w:id="85"/>
+      <w:bookmarkEnd w:id="86"/>
     </w:p>
     <w:p>
       <w:pPr>
@@ -3232,7 +3317,7 @@
       <w:r>
         <w:lastRenderedPageBreak/>
         <w:drawing>
-          <wp:inline distT="0" distB="0" distL="0" distR="0" wp14:anchorId="52A99C36" wp14:editId="4FDAA300">
+          <wp:inline distT="0" distB="0" distL="0" distR="0" wp14:anchorId="2D9C82F3" wp14:editId="68587C9E">
             <wp:extent cx="4714875" cy="2652052"/>
             <wp:effectExtent l="0" t="0" r="0" b="0"/>
             <wp:docPr id="3" name="Picture 2"/>
@@ -3249,7 +3334,7 @@
                     </pic:cNvPicPr>
                   </pic:nvPicPr>
                   <pic:blipFill>
-                    <a:blip r:embed="rId14" cstate="print">
+                    <a:blip r:embed="rId13" cstate="print">
                       <a:extLst>
                         <a:ext uri="{28A0092B-C50C-407E-A947-70E740481C1C}">
                           <a14:useLocalDpi xmlns:a14="http://schemas.microsoft.com/office/drawing/2010/main" val="0"/>
@@ -3277,8 +3362,8 @@
       </w:r>
     </w:p>
     <w:sectPr>
-      <w:headerReference w:type="default" r:id="rId15"/>
-      <w:footerReference w:type="default" r:id="rId16"/>
+      <w:headerReference w:type="default" r:id="rId14"/>
+      <w:footerReference w:type="default" r:id="rId15"/>
       <w:pgSz w:w="11906" w:h="16838"/>
       <w:pgMar w:top="1440" w:right="1440" w:bottom="1440" w:left="1440" w:header="680" w:footer="283" w:gutter="0"/>
       <w:cols w:space="708"/>
@@ -3302,6 +3387,13 @@
       <w:r>
         <w:continuationSeparator/>
       </w:r>
+    </w:p>
+  </w:endnote>
+  <w:endnote w:type="continuationNotice" w:id="1">
+    <w:p>
+      <w:pPr>
+        <w:spacing w:before="0" w:after="0" w:line="240" w:lineRule="auto"/>
+      </w:pPr>
     </w:p>
   </w:endnote>
 </w:endnotes>
@@ -3317,8 +3409,13 @@
       <w:t>Revision 1.</w:t>
     </w:r>
     <w:r>
-      <w:t>1</w:t>
+      <w:t>2</w:t>
     </w:r>
+    <w:del w:id="87" w:author="Comparison" w:date="2019-05-09T12:34:00Z">
+      <w:r>
+        <w:delText>0</w:delText>
+      </w:r>
+    </w:del>
     <w:r>
       <w:tab/>
     </w:r>
@@ -3343,6 +3440,9 @@
       <w:t>8</w:t>
     </w:r>
     <w:r>
+      <w:t>-2019</w:t>
+    </w:r>
+    <w:r>
       <w:tab/>
       <w:t xml:space="preserve">Page </w:t>
     </w:r>
@@ -3411,6 +3511,13 @@
       </w:r>
     </w:p>
   </w:footnote>
+  <w:footnote w:type="continuationNotice" w:id="1">
+    <w:p>
+      <w:pPr>
+        <w:spacing w:before="0" w:after="0" w:line="240" w:lineRule="auto"/>
+      </w:pPr>
+    </w:p>
+  </w:footnote>
 </w:footnotes>
 </file>
 
@@ -3422,7 +3529,7 @@
     </w:pPr>
     <w:r>
       <w:drawing>
-        <wp:anchor distT="0" distB="0" distL="114300" distR="114300" simplePos="0" relativeHeight="251659264" behindDoc="0" locked="0" layoutInCell="1" allowOverlap="1" wp14:anchorId="686E2EAC" wp14:editId="66016A54">
+        <wp:anchor distT="0" distB="0" distL="114300" distR="114300" simplePos="0" relativeHeight="251659264" behindDoc="0" locked="0" layoutInCell="1" allowOverlap="1" wp14:anchorId="5CE35A8D" wp14:editId="1915B90E">
           <wp:simplePos x="0" y="0"/>
           <wp:positionH relativeFrom="column">
             <wp:posOffset>-781050</wp:posOffset>
@@ -4291,7 +4398,7 @@
       </w:pPr>
     </w:pPrDefault>
   </w:docDefaults>
-  <w:latentStyles w:defLockedState="0" w:defUIPriority="99" w:defSemiHidden="0" w:defUnhideWhenUsed="0" w:defQFormat="0" w:count="375">
+  <w:latentStyles w:defLockedState="0" w:defUIPriority="99" w:defSemiHidden="0" w:defUnhideWhenUsed="0" w:defQFormat="0" w:count="376">
     <w:lsdException w:name="Normal" w:uiPriority="0" w:qFormat="1"/>
     <w:lsdException w:name="heading 1" w:uiPriority="9" w:qFormat="1"/>
     <w:lsdException w:name="heading 2" w:semiHidden="1" w:uiPriority="9" w:unhideWhenUsed="1" w:qFormat="1"/>
@@ -4667,6 +4774,7 @@
     <w:lsdException w:name="Smart Hyperlink" w:semiHidden="1" w:unhideWhenUsed="1"/>
     <w:lsdException w:name="Hashtag" w:semiHidden="1" w:unhideWhenUsed="1"/>
     <w:lsdException w:name="Unresolved Mention" w:semiHidden="1" w:unhideWhenUsed="1"/>
+    <w:lsdException w:name="Smart Link" w:semiHidden="1" w:unhideWhenUsed="1"/>
   </w:latentStyles>
   <w:style w:type="paragraph" w:default="1" w:styleId="Normal">
     <w:name w:val="Normal"/>
@@ -5839,16 +5947,44 @@
       <w:shd w:val="clear" w:color="auto" w:fill="E6E6E6"/>
     </w:rPr>
   </w:style>
+  <w:style w:type="paragraph" w:styleId="Revision">
+    <w:name w:val="Revision"/>
+    <w:hidden/>
+    <w:uiPriority w:val="99"/>
+    <w:semiHidden/>
+    <w:rsid w:val="0003215D"/>
+    <w:pPr>
+      <w:spacing w:after="0" w:line="240" w:lineRule="auto"/>
+    </w:pPr>
+    <w:rPr>
+      <w:rFonts w:ascii="Arial" w:hAnsi="Arial"/>
+      <w:color w:val="000000" w:themeColor="text1"/>
+      <w:sz w:val="24"/>
+      <w:lang w:val="en-US"/>
+    </w:rPr>
+  </w:style>
   <w:style w:type="character" w:styleId="FollowedHyperlink">
     <w:name w:val="FollowedHyperlink"/>
     <w:basedOn w:val="DefaultParagraphFont"/>
     <w:uiPriority w:val="99"/>
     <w:semiHidden/>
     <w:unhideWhenUsed/>
-    <w:rsid w:val="00FA4456"/>
+    <w:rsid w:val="0003215D"/>
     <w:rPr>
       <w:color w:val="954F72" w:themeColor="followedHyperlink"/>
       <w:u w:val="single"/>
+    </w:rPr>
+  </w:style>
+  <w:style w:type="character" w:styleId="UnresolvedMention">
+    <w:name w:val="Unresolved Mention"/>
+    <w:basedOn w:val="DefaultParagraphFont"/>
+    <w:uiPriority w:val="99"/>
+    <w:semiHidden/>
+    <w:unhideWhenUsed/>
+    <w:rsid w:val="0003215D"/>
+    <w:rPr>
+      <w:color w:val="605E5C"/>
+      <w:shd w:val="clear" w:color="auto" w:fill="E1DFDD"/>
     </w:rPr>
   </w:style>
 </w:styles>
@@ -6120,7 +6256,7 @@
 </file>
 
 <file path=customXml/itemProps1.xml><?xml version="1.0" encoding="utf-8"?>
-<ds:datastoreItem xmlns:ds="http://schemas.openxmlformats.org/officeDocument/2006/customXml" ds:itemID="{3A5A41BF-F860-4026-B470-62FEBE57EEFC}">
+<ds:datastoreItem xmlns:ds="http://schemas.openxmlformats.org/officeDocument/2006/customXml" ds:itemID="{1E2D40BE-9659-42EF-9377-BF4DC8D1DB12}">
   <ds:schemaRefs>
     <ds:schemaRef ds:uri="http://schemas.openxmlformats.org/officeDocument/2006/bibliography"/>
   </ds:schemaRefs>

</xml_diff>

<commit_message>
- Trapped error if TKinter does not work - Improved output on screen and worker specification to make the test purpose clearer
git-svn-id: https://quarchserver4.ds.quarch.com/svn/Software/Application%20Notes/AN-017%20-%20QPS%20performance%20test%20with%20FIO/Trunk@3568 265bcc82-57df-11dd-8522-2d0c19f12d9e
</commit_message>
<xml_diff>
--- a/AN-017 - QPS Performance test with FIO.docx
+++ b/AN-017 - QPS Performance test with FIO.docx
@@ -179,8 +179,6 @@
       <w:pPr>
         <w:pStyle w:val="Centredimage"/>
       </w:pPr>
-      <w:bookmarkStart w:id="44" w:name="_GoBack"/>
-      <w:bookmarkEnd w:id="44"/>
       <w:r>
         <w:drawing>
           <wp:inline distT="0" distB="0" distL="0" distR="0" wp14:anchorId="56311F47" wp14:editId="3589D683">
@@ -228,33 +226,34 @@
       <w:pPr>
         <w:pStyle w:val="Heading1"/>
       </w:pPr>
-      <w:bookmarkStart w:id="45" w:name="_Toc260389311"/>
-      <w:bookmarkStart w:id="46" w:name="_Toc262028175"/>
-      <w:bookmarkStart w:id="47" w:name="_Toc262029014"/>
-      <w:bookmarkStart w:id="48" w:name="_Toc262048129"/>
-      <w:bookmarkStart w:id="49" w:name="_Toc262048517"/>
-      <w:bookmarkStart w:id="50" w:name="_Toc262048569"/>
-      <w:bookmarkStart w:id="51" w:name="_Toc276715494"/>
-      <w:bookmarkStart w:id="52" w:name="_Toc276715534"/>
-      <w:bookmarkStart w:id="53" w:name="_Toc276716140"/>
-      <w:bookmarkStart w:id="54" w:name="_Toc276720080"/>
-      <w:bookmarkStart w:id="55" w:name="_Toc277602561"/>
+      <w:bookmarkStart w:id="44" w:name="_Toc260389311"/>
+      <w:bookmarkStart w:id="45" w:name="_Toc262028175"/>
+      <w:bookmarkStart w:id="46" w:name="_Toc262029014"/>
+      <w:bookmarkStart w:id="47" w:name="_Toc262048129"/>
+      <w:bookmarkStart w:id="48" w:name="_Toc262048517"/>
+      <w:bookmarkStart w:id="49" w:name="_Toc262048569"/>
+      <w:bookmarkStart w:id="50" w:name="_Toc276715494"/>
+      <w:bookmarkStart w:id="51" w:name="_Toc276715534"/>
+      <w:bookmarkStart w:id="52" w:name="_Toc276716140"/>
+      <w:bookmarkStart w:id="53" w:name="_Toc276720080"/>
+      <w:bookmarkStart w:id="54" w:name="_Toc277602561"/>
       <w:bookmarkEnd w:id="37"/>
       <w:r>
         <w:br w:type="page"/>
       </w:r>
-      <w:bookmarkStart w:id="56" w:name="_Toc359856653"/>
-      <w:bookmarkStart w:id="57" w:name="_Toc362960378"/>
-      <w:bookmarkStart w:id="58" w:name="_Toc372718893"/>
-      <w:bookmarkStart w:id="59" w:name="_Toc372718921"/>
-      <w:bookmarkStart w:id="60" w:name="_Toc372718985"/>
-      <w:bookmarkStart w:id="61" w:name="_Toc372720479"/>
-      <w:bookmarkStart w:id="62" w:name="_Toc465168329"/>
-      <w:bookmarkStart w:id="63" w:name="_Toc526171864"/>
+      <w:bookmarkStart w:id="55" w:name="_Toc359856653"/>
+      <w:bookmarkStart w:id="56" w:name="_Toc362960378"/>
+      <w:bookmarkStart w:id="57" w:name="_Toc372718893"/>
+      <w:bookmarkStart w:id="58" w:name="_Toc372718921"/>
+      <w:bookmarkStart w:id="59" w:name="_Toc372718985"/>
+      <w:bookmarkStart w:id="60" w:name="_Toc372720479"/>
+      <w:bookmarkStart w:id="61" w:name="_Toc465168329"/>
+      <w:bookmarkStart w:id="62" w:name="_Toc526171864"/>
       <w:r>
         <w:lastRenderedPageBreak/>
         <w:t>Change History</w:t>
       </w:r>
+      <w:bookmarkEnd w:id="44"/>
       <w:bookmarkEnd w:id="45"/>
       <w:bookmarkEnd w:id="46"/>
       <w:bookmarkEnd w:id="47"/>
@@ -273,7 +272,6 @@
       <w:bookmarkEnd w:id="60"/>
       <w:bookmarkEnd w:id="61"/>
       <w:bookmarkEnd w:id="62"/>
-      <w:bookmarkEnd w:id="63"/>
     </w:p>
     <w:tbl>
       <w:tblPr>
@@ -289,9 +287,9 @@
         <w:tblLook w:val="04A0" w:firstRow="1" w:lastRow="0" w:firstColumn="1" w:lastColumn="0" w:noHBand="0" w:noVBand="1"/>
       </w:tblPr>
       <w:tblGrid>
-        <w:gridCol w:w="992"/>
+        <w:gridCol w:w="993"/>
         <w:gridCol w:w="2592"/>
-        <w:gridCol w:w="5432"/>
+        <w:gridCol w:w="5431"/>
       </w:tblGrid>
       <w:tr>
         <w:tc>
@@ -327,7 +325,7 @@
             <w:tcW w:w="993" w:type="dxa"/>
           </w:tcPr>
           <w:p>
-            <w:ins w:id="64" w:author="Comparison" w:date="2019-05-09T12:34:00Z">
+            <w:ins w:id="63" w:author="Comparison" w:date="2019-05-09T12:34:00Z">
               <w:r>
                 <w:t>1.1</w:t>
               </w:r>
@@ -339,7 +337,7 @@
             <w:tcW w:w="2595" w:type="dxa"/>
           </w:tcPr>
           <w:p>
-            <w:ins w:id="65" w:author="Comparison" w:date="2019-05-09T12:34:00Z">
+            <w:ins w:id="64" w:author="Comparison" w:date="2019-05-09T12:34:00Z">
               <w:r>
                 <w:t>Feb 2019</w:t>
               </w:r>
@@ -351,7 +349,7 @@
             <w:tcW w:w="5438" w:type="dxa"/>
           </w:tcPr>
           <w:p>
-            <w:ins w:id="66" w:author="Comparison" w:date="2019-05-09T12:34:00Z">
+            <w:ins w:id="65" w:author="Comparison" w:date="2019-05-09T12:34:00Z">
               <w:r>
                 <w:t>Updated to Python 3.x</w:t>
               </w:r>
@@ -404,19 +402,31 @@
           <w:tcPr>
             <w:tcW w:w="993" w:type="dxa"/>
           </w:tcPr>
-          <w:p/>
+          <w:p>
+            <w:r>
+              <w:t>1.3</w:t>
+            </w:r>
+          </w:p>
         </w:tc>
         <w:tc>
           <w:tcPr>
             <w:tcW w:w="2595" w:type="dxa"/>
           </w:tcPr>
-          <w:p/>
+          <w:p>
+            <w:r>
+              <w:t>October 2020</w:t>
+            </w:r>
+          </w:p>
         </w:tc>
         <w:tc>
           <w:tcPr>
             <w:tcW w:w="5438" w:type="dxa"/>
           </w:tcPr>
-          <w:p/>
+          <w:p>
+            <w:r>
+              <w:t>Minor fixes and improvements to script output</w:t>
+            </w:r>
+          </w:p>
         </w:tc>
       </w:tr>
       <w:tr>
@@ -445,6 +455,8 @@
       <w:r>
         <w:br w:type="page"/>
       </w:r>
+      <w:bookmarkStart w:id="66" w:name="_GoBack"/>
+      <w:bookmarkEnd w:id="66"/>
     </w:p>
     <w:p>
       <w:pPr>
@@ -3409,7 +3421,7 @@
       <w:t>Revision 1.</w:t>
     </w:r>
     <w:r>
-      <w:t>2</w:t>
+      <w:t>3</w:t>
     </w:r>
     <w:del w:id="87" w:author="Comparison" w:date="2019-05-09T12:34:00Z">
       <w:r>
@@ -3423,15 +3435,7 @@
       <w:t>©</w:t>
     </w:r>
     <w:r>
-      <w:t xml:space="preserve"> </w:t>
-    </w:r>
-    <w:proofErr w:type="spellStart"/>
-    <w:r>
-      <w:t>Quarch</w:t>
-    </w:r>
-    <w:proofErr w:type="spellEnd"/>
-    <w:r>
-      <w:t xml:space="preserve"> Technology</w:t>
+      <w:t xml:space="preserve"> Quarch Technology</w:t>
     </w:r>
     <w:r>
       <w:t xml:space="preserve"> 201</w:t>
@@ -3440,7 +3444,10 @@
       <w:t>8</w:t>
     </w:r>
     <w:r>
-      <w:t>-2019</w:t>
+      <w:t>-20</w:t>
+    </w:r>
+    <w:r>
+      <w:t>20</w:t>
     </w:r>
     <w:r>
       <w:tab/>
@@ -6256,7 +6263,7 @@
 </file>
 
 <file path=customXml/itemProps1.xml><?xml version="1.0" encoding="utf-8"?>
-<ds:datastoreItem xmlns:ds="http://schemas.openxmlformats.org/officeDocument/2006/customXml" ds:itemID="{1E2D40BE-9659-42EF-9377-BF4DC8D1DB12}">
+<ds:datastoreItem xmlns:ds="http://schemas.openxmlformats.org/officeDocument/2006/customXml" ds:itemID="{EA01E750-E2D8-457E-9D7F-7986651892C1}">
   <ds:schemaRefs>
     <ds:schemaRef ds:uri="http://schemas.openxmlformats.org/officeDocument/2006/bibliography"/>
   </ds:schemaRefs>

</xml_diff>

<commit_message>
Removal of setup section from doc as its in the script now to match new application note format. Improved comments.
git-svn-id: https://quarchserver4.ds.quarch.com/svn/Software/Application%20Notes/AN-017%20-%20QPS%20performance%20test%20with%20FIO/Trunk@6803 265bcc82-57df-11dd-8522-2d0c19f12d9e
</commit_message>
<xml_diff>
--- a/AN-017 - QPS Performance test with FIO.docx
+++ b/AN-017 - QPS Performance test with FIO.docx
@@ -1,6 +1,6 @@
 
 <file path=word/document.xml><?xml version="1.0" encoding="utf-8"?>
-<w:document xmlns:wpc="http://schemas.microsoft.com/office/word/2010/wordprocessingCanvas" xmlns:cx="http://schemas.microsoft.com/office/drawing/2014/chartex" xmlns:cx1="http://schemas.microsoft.com/office/drawing/2015/9/8/chartex" xmlns:cx2="http://schemas.microsoft.com/office/drawing/2015/10/21/chartex" xmlns:cx3="http://schemas.microsoft.com/office/drawing/2016/5/9/chartex" xmlns:cx4="http://schemas.microsoft.com/office/drawing/2016/5/10/chartex" xmlns:cx5="http://schemas.microsoft.com/office/drawing/2016/5/11/chartex" xmlns:cx6="http://schemas.microsoft.com/office/drawing/2016/5/12/chartex" xmlns:cx7="http://schemas.microsoft.com/office/drawing/2016/5/13/chartex" xmlns:cx8="http://schemas.microsoft.com/office/drawing/2016/5/14/chartex" xmlns:mc="http://schemas.openxmlformats.org/markup-compatibility/2006" xmlns:aink="http://schemas.microsoft.com/office/drawing/2016/ink" xmlns:am3d="http://schemas.microsoft.com/office/drawing/2017/model3d" xmlns:o="urn:schemas-microsoft-com:office:office" xmlns:r="http://schemas.openxmlformats.org/officeDocument/2006/relationships" xmlns:m="http://schemas.openxmlformats.org/officeDocument/2006/math" xmlns:v="urn:schemas-microsoft-com:vml" xmlns:wp14="http://schemas.microsoft.com/office/word/2010/wordprocessingDrawing" xmlns:wp="http://schemas.openxmlformats.org/drawingml/2006/wordprocessingDrawing" xmlns:w10="urn:schemas-microsoft-com:office:word" xmlns:w="http://schemas.openxmlformats.org/wordprocessingml/2006/main" xmlns:w14="http://schemas.microsoft.com/office/word/2010/wordml" xmlns:w15="http://schemas.microsoft.com/office/word/2012/wordml" xmlns:w16cid="http://schemas.microsoft.com/office/word/2016/wordml/cid" xmlns:w16se="http://schemas.microsoft.com/office/word/2015/wordml/symex" xmlns:wpg="http://schemas.microsoft.com/office/word/2010/wordprocessingGroup" xmlns:wpi="http://schemas.microsoft.com/office/word/2010/wordprocessingInk" xmlns:wne="http://schemas.microsoft.com/office/word/2006/wordml" xmlns:wps="http://schemas.microsoft.com/office/word/2010/wordprocessingShape" mc:Ignorable="w14 w15 w16se w16cid wp14">
+<w:document xmlns:wpc="http://schemas.microsoft.com/office/word/2010/wordprocessingCanvas" xmlns:cx="http://schemas.microsoft.com/office/drawing/2014/chartex" xmlns:cx1="http://schemas.microsoft.com/office/drawing/2015/9/8/chartex" xmlns:cx2="http://schemas.microsoft.com/office/drawing/2015/10/21/chartex" xmlns:cx3="http://schemas.microsoft.com/office/drawing/2016/5/9/chartex" xmlns:cx4="http://schemas.microsoft.com/office/drawing/2016/5/10/chartex" xmlns:cx5="http://schemas.microsoft.com/office/drawing/2016/5/11/chartex" xmlns:cx6="http://schemas.microsoft.com/office/drawing/2016/5/12/chartex" xmlns:cx7="http://schemas.microsoft.com/office/drawing/2016/5/13/chartex" xmlns:cx8="http://schemas.microsoft.com/office/drawing/2016/5/14/chartex" xmlns:mc="http://schemas.openxmlformats.org/markup-compatibility/2006" xmlns:aink="http://schemas.microsoft.com/office/drawing/2016/ink" xmlns:am3d="http://schemas.microsoft.com/office/drawing/2017/model3d" xmlns:o="urn:schemas-microsoft-com:office:office" xmlns:oel="http://schemas.microsoft.com/office/2019/extlst" xmlns:r="http://schemas.openxmlformats.org/officeDocument/2006/relationships" xmlns:m="http://schemas.openxmlformats.org/officeDocument/2006/math" xmlns:v="urn:schemas-microsoft-com:vml" xmlns:wp14="http://schemas.microsoft.com/office/word/2010/wordprocessingDrawing" xmlns:wp="http://schemas.openxmlformats.org/drawingml/2006/wordprocessingDrawing" xmlns:w10="urn:schemas-microsoft-com:office:word" xmlns:w="http://schemas.openxmlformats.org/wordprocessingml/2006/main" xmlns:w14="http://schemas.microsoft.com/office/word/2010/wordml" xmlns:w15="http://schemas.microsoft.com/office/word/2012/wordml" xmlns:w16cex="http://schemas.microsoft.com/office/word/2018/wordml/cex" xmlns:w16cid="http://schemas.microsoft.com/office/word/2016/wordml/cid" xmlns:w16="http://schemas.microsoft.com/office/word/2018/wordml" xmlns:w16sdtdh="http://schemas.microsoft.com/office/word/2020/wordml/sdtdatahash" xmlns:w16se="http://schemas.microsoft.com/office/word/2015/wordml/symex" xmlns:wpg="http://schemas.microsoft.com/office/word/2010/wordprocessingGroup" xmlns:wpi="http://schemas.microsoft.com/office/word/2010/wordprocessingInk" xmlns:wne="http://schemas.microsoft.com/office/word/2006/wordml" xmlns:wps="http://schemas.microsoft.com/office/word/2010/wordprocessingShape" mc:Ignorable="w14 w15 w16se w16cid w16 w16cex w16sdtdh wp14">
   <w:body>
     <w:p>
       <w:bookmarkStart w:id="0" w:name="_Toc168887959"/>
@@ -150,14 +150,7 @@
         <w:rPr>
           <w:b/>
         </w:rPr>
-        <w:t>XLC Power Modules</w:t>
-      </w:r>
-      <w:r>
-        <w:rPr>
-          <w:b/>
-        </w:rPr>
-        <w:br/>
-        <w:t>HD Power Modules</w:t>
+        <w:t>All Streaming Power Module</w:t>
       </w:r>
     </w:p>
     <w:p>
@@ -455,8 +448,6 @@
       <w:r>
         <w:br w:type="page"/>
       </w:r>
-      <w:bookmarkStart w:id="66" w:name="_GoBack"/>
-      <w:bookmarkEnd w:id="66"/>
     </w:p>
     <w:p>
       <w:pPr>
@@ -1425,14 +1416,14 @@
       <w:r>
         <w:br w:type="page"/>
       </w:r>
-      <w:bookmarkStart w:id="67" w:name="_Toc475542641"/>
-      <w:bookmarkStart w:id="68" w:name="_Toc526171865"/>
+      <w:bookmarkStart w:id="66" w:name="_Toc475542641"/>
+      <w:bookmarkStart w:id="67" w:name="_Toc526171865"/>
       <w:r>
         <w:lastRenderedPageBreak/>
         <w:t>Introduction</w:t>
       </w:r>
+      <w:bookmarkEnd w:id="66"/>
       <w:bookmarkEnd w:id="67"/>
-      <w:bookmarkEnd w:id="68"/>
     </w:p>
     <w:p>
       <w:pPr>
@@ -1479,14 +1470,16 @@
       <w:pPr>
         <w:pStyle w:val="Heading1"/>
       </w:pPr>
-      <w:bookmarkStart w:id="69" w:name="_Toc475542642"/>
-      <w:bookmarkStart w:id="70" w:name="_Toc526171866"/>
-      <w:r>
-        <w:lastRenderedPageBreak/>
+      <w:bookmarkStart w:id="68" w:name="_Toc475542642"/>
+      <w:bookmarkStart w:id="69" w:name="_Toc526171866"/>
+      <w:r>
+        <w:t xml:space="preserve">Examples of </w:t>
+      </w:r>
+      <w:r>
         <w:t>Modules Supported</w:t>
       </w:r>
+      <w:bookmarkEnd w:id="68"/>
       <w:bookmarkEnd w:id="69"/>
-      <w:bookmarkEnd w:id="70"/>
     </w:p>
     <w:p>
       <w:r>
@@ -1532,630 +1525,7 @@
     </w:p>
     <w:p>
       <w:pPr>
-        <w:spacing w:before="0" w:after="160" w:line="259" w:lineRule="auto"/>
-      </w:pPr>
-    </w:p>
-    <w:p>
-      <w:pPr>
-        <w:pStyle w:val="Heading1"/>
-      </w:pPr>
-      <w:bookmarkStart w:id="71" w:name="_Toc526171867"/>
-      <w:r>
-        <w:t>System</w:t>
-      </w:r>
-      <w:r>
-        <w:t xml:space="preserve"> Supported</w:t>
-      </w:r>
-      <w:bookmarkEnd w:id="71"/>
-    </w:p>
-    <w:p>
-      <w:r>
-        <w:t>This example is written and tested on W</w:t>
-      </w:r>
-      <w:r>
-        <w:t xml:space="preserve">indows, though could </w:t>
-      </w:r>
-      <w:r>
-        <w:t>be used on MacOS and</w:t>
-      </w:r>
-      <w:r>
-        <w:t xml:space="preserve"> Linux </w:t>
-      </w:r>
-      <w:r>
-        <w:t>as long as FIO is installed</w:t>
-      </w:r>
-      <w:r>
-        <w:t>.</w:t>
-      </w:r>
-    </w:p>
-    <w:p>
-      <w:r>
-        <w:t xml:space="preserve">It currently requires Python </w:t>
-      </w:r>
-      <w:r>
-        <w:t>3</w:t>
-      </w:r>
-      <w:r>
-        <w:t>.x</w:t>
-      </w:r>
-    </w:p>
-    <w:p>
-      <w:pPr>
-        <w:spacing w:before="0" w:after="160" w:line="259" w:lineRule="auto"/>
-      </w:pPr>
-    </w:p>
-    <w:p>
-      <w:pPr>
-        <w:pStyle w:val="Heading2"/>
-      </w:pPr>
-      <w:bookmarkStart w:id="72" w:name="_Toc512349227"/>
-      <w:bookmarkStart w:id="73" w:name="_Toc526171868"/>
-      <w:r>
-        <w:t>Application Note Example Files</w:t>
-      </w:r>
-      <w:bookmarkEnd w:id="72"/>
-      <w:bookmarkEnd w:id="73"/>
-    </w:p>
-    <w:p>
-      <w:pPr>
-        <w:rPr>
-          <w:color w:val="000000"/>
-          <w:szCs w:val="28"/>
-        </w:rPr>
-      </w:pPr>
-      <w:r>
-        <w:rPr>
-          <w:color w:val="000000"/>
-          <w:szCs w:val="28"/>
-        </w:rPr>
-        <w:t xml:space="preserve">The </w:t>
-      </w:r>
-      <w:r>
-        <w:rPr>
-          <w:b/>
-          <w:bCs/>
-          <w:color w:val="000000"/>
-          <w:szCs w:val="28"/>
-        </w:rPr>
-        <w:t>AN-017</w:t>
-      </w:r>
-      <w:r>
-        <w:rPr>
-          <w:b/>
-          <w:bCs/>
-          <w:color w:val="000000"/>
-          <w:szCs w:val="28"/>
-        </w:rPr>
-        <w:t>.zip</w:t>
-      </w:r>
-      <w:r>
-        <w:rPr>
-          <w:color w:val="000000"/>
-          <w:szCs w:val="28"/>
-        </w:rPr>
-        <w:t xml:space="preserve"> should be extracted to your preferred location.</w:t>
-      </w:r>
-    </w:p>
-    <w:tbl>
-      <w:tblPr>
-        <w:tblStyle w:val="TableGrid"/>
-        <w:tblW w:w="0" w:type="auto"/>
-        <w:tblLook w:val="04A0" w:firstRow="1" w:lastRow="0" w:firstColumn="1" w:lastColumn="0" w:noHBand="0" w:noVBand="1"/>
-      </w:tblPr>
-      <w:tblGrid>
-        <w:gridCol w:w="3256"/>
-        <w:gridCol w:w="5760"/>
-      </w:tblGrid>
-      <w:tr>
-        <w:tc>
-          <w:tcPr>
-            <w:tcW w:w="3256" w:type="dxa"/>
-          </w:tcPr>
-          <w:p>
-            <w:pPr>
-              <w:rPr>
-                <w:color w:val="000000"/>
-                <w:szCs w:val="28"/>
-              </w:rPr>
-            </w:pPr>
-            <w:r>
-              <w:rPr>
-                <w:color w:val="000000"/>
-                <w:szCs w:val="28"/>
-              </w:rPr>
-              <w:t>scriptFIO.py</w:t>
-            </w:r>
-          </w:p>
-        </w:tc>
-        <w:tc>
-          <w:tcPr>
-            <w:tcW w:w="5760" w:type="dxa"/>
-          </w:tcPr>
-          <w:p>
-            <w:pPr>
-              <w:rPr>
-                <w:color w:val="000000"/>
-                <w:szCs w:val="28"/>
-              </w:rPr>
-            </w:pPr>
-            <w:r>
-              <w:rPr>
-                <w:color w:val="000000"/>
-                <w:szCs w:val="28"/>
-              </w:rPr>
-              <w:t>Main python file to execute</w:t>
-            </w:r>
-          </w:p>
-        </w:tc>
-      </w:tr>
-      <w:tr>
-        <w:tc>
-          <w:tcPr>
-            <w:tcW w:w="3256" w:type="dxa"/>
-          </w:tcPr>
-          <w:p>
-            <w:pPr>
-              <w:rPr>
-                <w:color w:val="000000"/>
-                <w:szCs w:val="28"/>
-              </w:rPr>
-            </w:pPr>
-            <w:proofErr w:type="spellStart"/>
-            <w:r>
-              <w:rPr>
-                <w:color w:val="000000"/>
-                <w:szCs w:val="28"/>
-              </w:rPr>
-              <w:t>jobFileExample.fio</w:t>
-            </w:r>
-            <w:proofErr w:type="spellEnd"/>
-          </w:p>
-        </w:tc>
-        <w:tc>
-          <w:tcPr>
-            <w:tcW w:w="5760" w:type="dxa"/>
-          </w:tcPr>
-          <w:p>
-            <w:pPr>
-              <w:rPr>
-                <w:color w:val="000000"/>
-                <w:szCs w:val="28"/>
-              </w:rPr>
-            </w:pPr>
-            <w:r>
-              <w:rPr>
-                <w:color w:val="000000"/>
-                <w:szCs w:val="28"/>
-              </w:rPr>
-              <w:t xml:space="preserve">FIO </w:t>
-            </w:r>
-            <w:r>
-              <w:rPr>
-                <w:color w:val="000000"/>
-                <w:szCs w:val="28"/>
-              </w:rPr>
-              <w:t xml:space="preserve">Example </w:t>
-            </w:r>
-            <w:r>
-              <w:rPr>
-                <w:color w:val="000000"/>
-                <w:szCs w:val="28"/>
-              </w:rPr>
-              <w:t>configuration file</w:t>
-            </w:r>
-          </w:p>
-        </w:tc>
-      </w:tr>
-    </w:tbl>
-    <w:p>
-      <w:pPr>
-        <w:pStyle w:val="Heading1"/>
-      </w:pPr>
-      <w:bookmarkStart w:id="74" w:name="_Toc475542643"/>
-      <w:bookmarkStart w:id="75" w:name="_Toc526171869"/>
-      <w:r>
-        <w:t>Installation and setup</w:t>
-      </w:r>
-      <w:bookmarkEnd w:id="74"/>
-      <w:bookmarkEnd w:id="75"/>
-    </w:p>
-    <w:p>
-      <w:pPr>
-        <w:pStyle w:val="Heading2"/>
-      </w:pPr>
-      <w:bookmarkStart w:id="76" w:name="_Toc512349230"/>
-      <w:bookmarkStart w:id="77" w:name="_Toc526171870"/>
-      <w:r>
-        <w:t>Python install</w:t>
-      </w:r>
-      <w:bookmarkEnd w:id="76"/>
-      <w:bookmarkEnd w:id="77"/>
-    </w:p>
-    <w:p>
-      <w:r>
-        <w:t xml:space="preserve">If you do not already have Python </w:t>
-      </w:r>
-      <w:r>
-        <w:t xml:space="preserve">3.x </w:t>
-      </w:r>
-      <w:r>
-        <w:t>installed, download and install it from:</w:t>
-      </w:r>
-    </w:p>
-    <w:p>
-      <w:pPr>
-        <w:rPr>
-          <w:rStyle w:val="Hyperlink"/>
-          <w:rFonts w:ascii="Helvetica Neue" w:hAnsi="Helvetica Neue"/>
-          <w:sz w:val="28"/>
-          <w:szCs w:val="28"/>
-        </w:rPr>
-      </w:pPr>
-      <w:hyperlink r:id="rId9" w:history="1">
-        <w:r>
-          <w:rPr>
-            <w:rStyle w:val="Hyperlink"/>
-            <w:rFonts w:ascii="Helvetica Neue" w:hAnsi="Helvetica Neue"/>
-            <w:sz w:val="28"/>
-            <w:szCs w:val="28"/>
-          </w:rPr>
-          <w:t>https://www.python.org/downloads/</w:t>
-        </w:r>
-      </w:hyperlink>
-    </w:p>
-    <w:p>
-      <w:r>
-        <w:t xml:space="preserve">Under Windows </w:t>
-      </w:r>
-      <w:r>
-        <w:t xml:space="preserve">it is helpful to </w:t>
-      </w:r>
-      <w:r>
-        <w:t xml:space="preserve">make sure the Python installation directory and </w:t>
-      </w:r>
-      <w:proofErr w:type="spellStart"/>
-      <w:r>
-        <w:t>PythonXX</w:t>
-      </w:r>
-      <w:proofErr w:type="spellEnd"/>
-      <w:r>
-        <w:t>\Scripts are included in the PATH environment variable. See</w:t>
-      </w:r>
-      <w:r>
-        <w:t>:</w:t>
-      </w:r>
-    </w:p>
-    <w:bookmarkStart w:id="78" w:name="_Toc512349231"/>
-    <w:bookmarkStart w:id="79" w:name="_Toc526171871"/>
-    <w:p>
-      <w:pPr>
-        <w:pStyle w:val="Heading2"/>
-        <w:rPr>
-          <w:rFonts w:eastAsiaTheme="minorHAnsi" w:cstheme="minorBidi"/>
-          <w:b w:val="0"/>
-          <w:color w:val="000000" w:themeColor="text1"/>
-          <w:sz w:val="24"/>
-          <w:szCs w:val="22"/>
-        </w:rPr>
-      </w:pPr>
-      <w:r>
-        <w:rPr>
-          <w:rFonts w:eastAsiaTheme="minorHAnsi" w:cstheme="minorBidi"/>
-          <w:b w:val="0"/>
-          <w:color w:val="000000" w:themeColor="text1"/>
-          <w:sz w:val="24"/>
-          <w:szCs w:val="22"/>
-        </w:rPr>
-        <w:lastRenderedPageBreak/>
-        <w:fldChar w:fldCharType="begin"/>
-      </w:r>
-      <w:r>
-        <w:rPr>
-          <w:rFonts w:eastAsiaTheme="minorHAnsi" w:cstheme="minorBidi"/>
-          <w:b w:val="0"/>
-          <w:color w:val="000000" w:themeColor="text1"/>
-          <w:sz w:val="24"/>
-          <w:szCs w:val="22"/>
-        </w:rPr>
-        <w:instrText xml:space="preserve"> HYPERLINK "https://docs.python.org/3/using/windows.html" \l "excursus-setting-environment-variables" </w:instrText>
-      </w:r>
-      <w:r>
-        <w:rPr>
-          <w:rFonts w:eastAsiaTheme="minorHAnsi" w:cstheme="minorBidi"/>
-          <w:b w:val="0"/>
-          <w:color w:val="000000" w:themeColor="text1"/>
-          <w:sz w:val="24"/>
-          <w:szCs w:val="22"/>
-        </w:rPr>
-        <w:fldChar w:fldCharType="separate"/>
-      </w:r>
-      <w:r>
-        <w:rPr>
-          <w:rStyle w:val="Hyperlink"/>
-          <w:rFonts w:eastAsiaTheme="minorHAnsi" w:cstheme="minorBidi"/>
-          <w:b w:val="0"/>
-          <w:szCs w:val="22"/>
-        </w:rPr>
-        <w:t>https://docs.python.org/3/using/windows.html#excursus-setting-environment-variables</w:t>
-      </w:r>
-      <w:r>
-        <w:rPr>
-          <w:rFonts w:eastAsiaTheme="minorHAnsi" w:cstheme="minorBidi"/>
-          <w:b w:val="0"/>
-          <w:color w:val="000000" w:themeColor="text1"/>
-          <w:sz w:val="24"/>
-          <w:szCs w:val="22"/>
-        </w:rPr>
-        <w:fldChar w:fldCharType="end"/>
-      </w:r>
-    </w:p>
-    <w:p>
-      <w:pPr>
-        <w:pStyle w:val="Heading2"/>
-      </w:pPr>
-      <w:proofErr w:type="spellStart"/>
-      <w:r>
-        <w:t>QuarchPy</w:t>
-      </w:r>
-      <w:proofErr w:type="spellEnd"/>
-      <w:r>
-        <w:t xml:space="preserve"> library install</w:t>
-      </w:r>
-      <w:bookmarkEnd w:id="78"/>
-      <w:bookmarkEnd w:id="79"/>
-    </w:p>
-    <w:p>
-      <w:r>
-        <w:t>The Quarch Python package can be installed from the Python web repository (assuming you have internet access) or via the download from our website.</w:t>
-      </w:r>
-    </w:p>
-    <w:p>
-      <w:proofErr w:type="spellStart"/>
-      <w:r>
-        <w:t>Quarchpy</w:t>
-      </w:r>
-      <w:proofErr w:type="spellEnd"/>
-      <w:r>
-        <w:t xml:space="preserve"> will also install a version of Quarch Power Studio</w:t>
-      </w:r>
-    </w:p>
-    <w:p>
-      <w:pPr>
-        <w:pStyle w:val="Heading3"/>
-      </w:pPr>
-      <w:r>
-        <w:t>Web Install</w:t>
-      </w:r>
-    </w:p>
-    <w:p>
-      <w:r>
-        <w:t>From the command line:</w:t>
-      </w:r>
-    </w:p>
-    <w:p>
-      <w:pPr>
-        <w:pStyle w:val="Code"/>
-        <w:rPr>
-          <w:b/>
-        </w:rPr>
-      </w:pPr>
-      <w:r>
-        <w:rPr>
-          <w:b/>
-        </w:rPr>
-        <w:t xml:space="preserve">&gt;pip install </w:t>
-      </w:r>
-      <w:proofErr w:type="spellStart"/>
-      <w:r>
-        <w:rPr>
-          <w:b/>
-        </w:rPr>
-        <w:t>quarchpy</w:t>
-      </w:r>
-      <w:proofErr w:type="spellEnd"/>
-    </w:p>
-    <w:p>
-      <w:r>
-        <w:t>If this fails, your path to “pip” may not be set, you can instead run:</w:t>
-      </w:r>
-    </w:p>
-    <w:p>
-      <w:pPr>
-        <w:pStyle w:val="Code"/>
-        <w:rPr>
-          <w:b/>
-        </w:rPr>
-      </w:pPr>
-      <w:r>
-        <w:rPr>
-          <w:b/>
-        </w:rPr>
-        <w:t xml:space="preserve">&gt;python –m pip install </w:t>
-      </w:r>
-      <w:proofErr w:type="spellStart"/>
-      <w:r>
-        <w:rPr>
-          <w:b/>
-        </w:rPr>
-        <w:t>quarchpy</w:t>
-      </w:r>
-      <w:proofErr w:type="spellEnd"/>
-    </w:p>
-    <w:p>
-      <w:pPr>
-        <w:pStyle w:val="Heading3"/>
-      </w:pPr>
-      <w:r>
-        <w:t>Local Install</w:t>
-      </w:r>
-    </w:p>
-    <w:p>
-      <w:r>
-        <w:t>If you want to install from a downloaded folder, ensure the folder is unzipped to a local disk, navigate to the folder containing the setup.py file and run (noting the ‘.’ on the end):</w:t>
-      </w:r>
-    </w:p>
-    <w:p>
-      <w:pPr>
-        <w:pStyle w:val="Code"/>
-        <w:rPr>
-          <w:b/>
-        </w:rPr>
-      </w:pPr>
-      <w:r>
-        <w:rPr>
-          <w:b/>
-        </w:rPr>
-        <w:t xml:space="preserve">&gt;pip install </w:t>
-      </w:r>
-      <w:proofErr w:type="spellStart"/>
-      <w:proofErr w:type="gramStart"/>
-      <w:r>
-        <w:rPr>
-          <w:b/>
-        </w:rPr>
-        <w:t>quarchpy</w:t>
-      </w:r>
-      <w:proofErr w:type="spellEnd"/>
-      <w:r>
-        <w:rPr>
-          <w:b/>
-        </w:rPr>
-        <w:t xml:space="preserve"> .</w:t>
-      </w:r>
-      <w:proofErr w:type="gramEnd"/>
-    </w:p>
-    <w:p>
-      <w:r>
-        <w:t>If this fails, your path to ‘pip’ may not be set, you can instead run:</w:t>
-      </w:r>
-    </w:p>
-    <w:p>
-      <w:pPr>
-        <w:pStyle w:val="Code"/>
-        <w:rPr>
-          <w:b/>
-        </w:rPr>
-      </w:pPr>
-      <w:r>
-        <w:rPr>
-          <w:b/>
-        </w:rPr>
-        <w:t xml:space="preserve">&gt;python –m pip install </w:t>
-      </w:r>
-      <w:proofErr w:type="spellStart"/>
-      <w:proofErr w:type="gramStart"/>
-      <w:r>
-        <w:rPr>
-          <w:b/>
-        </w:rPr>
-        <w:t>quarchpy</w:t>
-      </w:r>
-      <w:proofErr w:type="spellEnd"/>
-      <w:r>
-        <w:rPr>
-          <w:b/>
-        </w:rPr>
-        <w:t xml:space="preserve"> .</w:t>
-      </w:r>
-      <w:proofErr w:type="gramEnd"/>
-    </w:p>
-    <w:p>
-      <w:pPr>
-        <w:spacing w:before="0" w:after="160" w:line="259" w:lineRule="auto"/>
-        <w:rPr>
-          <w:rFonts w:eastAsiaTheme="majorEastAsia" w:cstheme="majorBidi"/>
-          <w:color w:val="2E74B5" w:themeColor="accent1" w:themeShade="BF"/>
-          <w:szCs w:val="24"/>
-        </w:rPr>
-      </w:pPr>
-      <w:r>
-        <w:br w:type="page"/>
-      </w:r>
-    </w:p>
-    <w:p>
-      <w:pPr>
-        <w:pStyle w:val="Heading3"/>
-      </w:pPr>
-      <w:r>
-        <w:lastRenderedPageBreak/>
-        <w:t>Upgrade</w:t>
-      </w:r>
-    </w:p>
-    <w:p>
-      <w:r>
-        <w:t xml:space="preserve">If you already have </w:t>
-      </w:r>
-      <w:proofErr w:type="spellStart"/>
-      <w:r>
-        <w:t>QuarchPy</w:t>
-      </w:r>
-      <w:proofErr w:type="spellEnd"/>
-      <w:r>
-        <w:t xml:space="preserve"> installed, you will get a failure message. If you want to upgrade to a new version, you need to add the ‘--upgrade’ command:</w:t>
-      </w:r>
-    </w:p>
-    <w:p>
-      <w:pPr>
-        <w:pStyle w:val="Code"/>
-        <w:rPr>
-          <w:b/>
-        </w:rPr>
-      </w:pPr>
-      <w:r>
-        <w:rPr>
-          <w:b/>
-        </w:rPr>
-        <w:t xml:space="preserve">&gt;pip install --upgrade </w:t>
-      </w:r>
-      <w:proofErr w:type="spellStart"/>
-      <w:r>
-        <w:rPr>
-          <w:b/>
-        </w:rPr>
-        <w:t>quarchpy</w:t>
-      </w:r>
-      <w:proofErr w:type="spellEnd"/>
-    </w:p>
-    <w:p>
-      <w:r>
-        <w:t>The --upgrade command can similarly be used in any of the other examples, to load from a local install folder.</w:t>
-      </w:r>
-    </w:p>
-    <w:p>
-      <w:pPr>
-        <w:ind w:left="1440"/>
-      </w:pPr>
-    </w:p>
-    <w:p>
-      <w:pPr>
-        <w:spacing w:before="0" w:after="160" w:line="259" w:lineRule="auto"/>
-        <w:rPr>
-          <w:rFonts w:eastAsiaTheme="majorEastAsia" w:cstheme="majorBidi"/>
-          <w:b/>
-          <w:color w:val="2E74B5" w:themeColor="accent1" w:themeShade="BF"/>
-          <w:sz w:val="32"/>
-          <w:szCs w:val="26"/>
-        </w:rPr>
-      </w:pPr>
-      <w:bookmarkStart w:id="80" w:name="_Toc512349233"/>
-      <w:r>
-        <w:br w:type="page"/>
-      </w:r>
-    </w:p>
-    <w:p>
-      <w:pPr>
-        <w:pStyle w:val="Heading2"/>
-      </w:pPr>
-      <w:bookmarkStart w:id="81" w:name="_Toc526171872"/>
-      <w:r>
-        <w:lastRenderedPageBreak/>
-        <w:t>Java install</w:t>
-      </w:r>
-      <w:bookmarkEnd w:id="81"/>
-    </w:p>
-    <w:p>
-      <w:pPr>
-        <w:pStyle w:val="QNumberedlist"/>
+        <w:pStyle w:val="QBulletlist"/>
         <w:numPr>
           <w:ilvl w:val="0"/>
           <w:numId w:val="0"/>
@@ -2163,46 +1533,20 @@
         <w:ind w:left="567" w:hanging="567"/>
       </w:pPr>
       <w:r>
-        <w:t>Check that the Java JRE is installed</w:t>
+        <w:t>PAM</w:t>
       </w:r>
     </w:p>
     <w:p>
       <w:pPr>
-        <w:spacing w:before="0" w:after="160" w:line="259" w:lineRule="auto"/>
-      </w:pPr>
-      <w:r>
-        <w:t>You can find install instructions and files here:</w:t>
-      </w:r>
-      <w:r>
-        <w:br/>
-      </w:r>
-      <w:hyperlink r:id="rId10" w:history="1">
-        <w:r>
-          <w:rPr>
-            <w:rStyle w:val="Hyperlink"/>
-          </w:rPr>
-          <w:t>http://www.oracle.com/technetwork/java/javase/downloads/index.html</w:t>
-        </w:r>
-      </w:hyperlink>
+        <w:pStyle w:val="QBulletlist"/>
+      </w:pPr>
+      <w:r>
+        <w:t>QTL2312 - With all power measurement fixtures.</w:t>
+      </w:r>
     </w:p>
     <w:p>
       <w:pPr>
-        <w:spacing w:before="0" w:after="160" w:line="259" w:lineRule="auto"/>
-      </w:pPr>
-    </w:p>
-    <w:p>
-      <w:pPr>
-        <w:pStyle w:val="Heading2"/>
-      </w:pPr>
-      <w:bookmarkStart w:id="82" w:name="_Toc526171873"/>
-      <w:r>
-        <w:t>QPS install</w:t>
-      </w:r>
-      <w:bookmarkEnd w:id="82"/>
-    </w:p>
-    <w:p>
-      <w:pPr>
-        <w:pStyle w:val="QNumberedlist"/>
+        <w:pStyle w:val="QBulletlist"/>
         <w:numPr>
           <w:ilvl w:val="0"/>
           <w:numId w:val="0"/>
@@ -2210,146 +1554,24 @@
         <w:ind w:left="567" w:hanging="567"/>
       </w:pPr>
       <w:r>
-        <w:t>Current versions of QPS are provided as a portable (non-install) .jar file</w:t>
+        <w:t>All streaming power modules should be accepted but may not be listed here.</w:t>
       </w:r>
     </w:p>
     <w:p>
       <w:pPr>
         <w:spacing w:before="0" w:after="160" w:line="259" w:lineRule="auto"/>
-        <w:rPr>
-          <w:rStyle w:val="Hyperlink"/>
-        </w:rPr>
-      </w:pPr>
-      <w:r>
-        <w:t>The latest version can be downloaded from here:</w:t>
-      </w:r>
-      <w:r>
-        <w:br/>
-      </w:r>
-      <w:hyperlink r:id="rId11" w:history="1">
-        <w:r>
-          <w:rPr>
-            <w:rStyle w:val="Hyperlink"/>
-          </w:rPr>
-          <w:t>https://quarch.com/products/quarch-power-studio</w:t>
-        </w:r>
-      </w:hyperlink>
+      </w:pPr>
     </w:p>
     <w:p>
       <w:pPr>
-        <w:spacing w:before="0" w:after="160" w:line="259" w:lineRule="auto"/>
-        <w:rPr>
-          <w:rStyle w:val="Hyperlink"/>
-        </w:rPr>
-      </w:pPr>
-    </w:p>
-    <w:p>
-      <w:pPr>
         <w:pStyle w:val="Heading2"/>
       </w:pPr>
-      <w:bookmarkStart w:id="83" w:name="_Toc526171874"/>
-      <w:r>
-        <w:t>FIO install</w:t>
-      </w:r>
-      <w:bookmarkEnd w:id="83"/>
-    </w:p>
-    <w:p>
-      <w:proofErr w:type="spellStart"/>
-      <w:r>
-        <w:t>QuarchPy</w:t>
-      </w:r>
-      <w:proofErr w:type="spellEnd"/>
-      <w:r>
-        <w:t xml:space="preserve"> doesn’t ship with FIO. Follow the installation procedures described in </w:t>
-      </w:r>
-      <w:hyperlink r:id="rId12" w:history="1">
-        <w:r>
-          <w:rPr>
-            <w:rStyle w:val="Hyperlink"/>
-            <w:szCs w:val="28"/>
-          </w:rPr>
-          <w:t>https://github.com/axboe/fio</w:t>
-        </w:r>
-      </w:hyperlink>
-      <w:r>
-        <w:t xml:space="preserve"> </w:t>
-      </w:r>
-      <w:r>
-        <w:t xml:space="preserve">according to your system </w:t>
-      </w:r>
-      <w:r>
-        <w:t xml:space="preserve">and make sure the command </w:t>
-      </w:r>
-      <w:proofErr w:type="spellStart"/>
-      <w:r>
-        <w:rPr>
-          <w:i/>
-        </w:rPr>
-        <w:t>fio</w:t>
-      </w:r>
-      <w:proofErr w:type="spellEnd"/>
-      <w:r>
-        <w:rPr>
-          <w:i/>
-        </w:rPr>
-        <w:t xml:space="preserve"> </w:t>
-      </w:r>
-      <w:r>
-        <w:t xml:space="preserve">is available in the system’s shell. </w:t>
-      </w:r>
-    </w:p>
-    <w:p/>
-    <w:p>
-      <w:pPr>
-        <w:spacing w:before="0" w:after="160" w:line="259" w:lineRule="auto"/>
-        <w:rPr>
-          <w:rStyle w:val="Hyperlink"/>
-        </w:rPr>
-      </w:pPr>
-    </w:p>
-    <w:p>
-      <w:pPr>
-        <w:spacing w:before="0" w:after="160" w:line="259" w:lineRule="auto"/>
-        <w:rPr>
-          <w:rStyle w:val="Hyperlink"/>
-        </w:rPr>
-      </w:pPr>
-    </w:p>
-    <w:p>
-      <w:pPr>
-        <w:spacing w:before="0" w:after="160" w:line="259" w:lineRule="auto"/>
-      </w:pPr>
-    </w:p>
-    <w:p>
-      <w:pPr>
-        <w:spacing w:before="0" w:after="160" w:line="259" w:lineRule="auto"/>
-      </w:pPr>
-    </w:p>
-    <w:p>
-      <w:pPr>
-        <w:spacing w:before="0" w:after="160" w:line="259" w:lineRule="auto"/>
-        <w:rPr>
-          <w:rFonts w:eastAsiaTheme="majorEastAsia" w:cstheme="majorBidi"/>
-          <w:b/>
-          <w:color w:val="2E74B5" w:themeColor="accent1" w:themeShade="BF"/>
-          <w:sz w:val="32"/>
-          <w:szCs w:val="26"/>
-        </w:rPr>
-      </w:pPr>
-      <w:r>
-        <w:br w:type="page"/>
-      </w:r>
-    </w:p>
-    <w:p>
-      <w:pPr>
-        <w:pStyle w:val="Heading2"/>
-      </w:pPr>
-      <w:bookmarkStart w:id="84" w:name="_Toc526171875"/>
-      <w:r>
-        <w:lastRenderedPageBreak/>
+      <w:bookmarkStart w:id="70" w:name="_Toc512349233"/>
+      <w:bookmarkStart w:id="71" w:name="_Toc526171875"/>
+      <w:r>
         <w:t>Power module setup</w:t>
       </w:r>
-      <w:bookmarkEnd w:id="84"/>
+      <w:bookmarkEnd w:id="71"/>
     </w:p>
     <w:p>
       <w:r>
@@ -2509,7 +1731,7 @@
           </mc:Choice>
           <mc:Fallback>
             <w:pict>
-              <v:rect w14:anchorId="59AABF92" id="Rectangle 10" o:spid="_x0000_s1026" style="position:absolute;margin-left:97.8pt;margin-top:173.35pt;width:119.4pt;height:43.2pt;z-index:251660288;visibility:visible;mso-wrap-style:square;mso-wrap-distance-left:9pt;mso-wrap-distance-top:0;mso-wrap-distance-right:9pt;mso-wrap-distance-bottom:0;mso-position-horizontal:absolute;mso-position-horizontal-relative:text;mso-position-vertical:absolute;mso-position-vertical-relative:text;v-text-anchor:middle" o:gfxdata="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" fillcolor="#9ecb81 [2169]" strokecolor="#70ad47 [3209]" strokeweight=".5pt">
+              <v:rect w14:anchorId="20EE09F9" id="Rectangle 10" o:spid="_x0000_s1026" style="position:absolute;margin-left:97.8pt;margin-top:173.35pt;width:119.4pt;height:43.2pt;z-index:251660288;visibility:visible;mso-wrap-style:square;mso-wrap-distance-left:9pt;mso-wrap-distance-top:0;mso-wrap-distance-right:9pt;mso-wrap-distance-bottom:0;mso-position-horizontal:absolute;mso-position-horizontal-relative:text;mso-position-vertical:absolute;mso-position-vertical-relative:text;v-text-anchor:middle" o:gfxdata="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" fillcolor="#9ecb81 [2169]" strokecolor="#70ad47 [3209]" strokeweight=".5pt">
                 <v:fill color2="#8ac066 [2617]" rotate="t" colors="0 #b5d5a7;.5 #aace99;1 #9cca86" focus="100%" type="gradient">
                   <o:fill v:ext="view" type="gradientUnscaled"/>
                 </v:fill>
@@ -2611,11 +1833,11 @@
           </mc:Choice>
           <mc:Fallback>
             <w:pict>
-              <v:shapetype w14:anchorId="180A74ED" id="_x0000_t202" coordsize="21600,21600" o:spt="202" path="m,l,21600r21600,l21600,xe">
+              <v:shapetype w14:anchorId="3C1A93AA" id="_x0000_t202" coordsize="21600,21600" o:spt="202" path="m,l,21600r21600,l21600,xe">
                 <v:stroke joinstyle="miter"/>
                 <v:path gradientshapeok="t" o:connecttype="rect"/>
               </v:shapetype>
-              <v:shape id="Text Box 2" o:spid="_x0000_s1027" type="#_x0000_t202" style="position:absolute;margin-left:161.4pt;margin-top:48.3pt;width:148.8pt;height:110.6pt;z-index:251663360;visibility:visible;mso-wrap-style:square;mso-width-percent:0;mso-height-percent:200;mso-wrap-distance-left:9pt;mso-wrap-distance-top:3.6pt;mso-wrap-distance-right:9pt;mso-wrap-distance-bottom:3.6pt;mso-position-horizontal:absolute;mso-position-horizontal-relative:margin;mso-position-vertical:absolute;mso-position-vertical-relative:text;mso-width-percent:0;mso-height-percent:200;mso-width-relative:margin;mso-height-relative:margin;v-text-anchor:top" o:gfxdata="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" stroked="f">
+              <v:shape id="Text Box 2" o:spid="_x0000_s1027" type="#_x0000_t202" style="position:absolute;margin-left:161.4pt;margin-top:48.3pt;width:148.8pt;height:110.6pt;z-index:251663360;visibility:visible;mso-wrap-style:square;mso-width-percent:0;mso-height-percent:200;mso-wrap-distance-left:9pt;mso-wrap-distance-top:3.6pt;mso-wrap-distance-right:9pt;mso-wrap-distance-bottom:3.6pt;mso-position-horizontal:absolute;mso-position-horizontal-relative:margin;mso-position-vertical:absolute;mso-position-vertical-relative:text;mso-width-percent:0;mso-height-percent:200;mso-width-relative:margin;mso-height-relative:margin;v-text-anchor:top" o:gfxdata="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" stroked="f">
                 <v:textbox style="mso-fit-shape-to-text:t">
                   <w:txbxContent>
                     <w:p>
@@ -2782,7 +2004,7 @@
           </mc:Choice>
           <mc:Fallback>
             <w:pict>
-              <v:rect w14:anchorId="569E70F9" id="Rectangle 1" o:spid="_x0000_s1028" style="position:absolute;margin-left:97.15pt;margin-top:97.5pt;width:119.4pt;height:43.2pt;z-index:251659264;visibility:visible;mso-wrap-style:square;mso-width-percent:0;mso-wrap-distance-left:9pt;mso-wrap-distance-top:0;mso-wrap-distance-right:9pt;mso-wrap-distance-bottom:0;mso-position-horizontal:absolute;mso-position-horizontal-relative:text;mso-position-vertical:absolute;mso-position-vertical-relative:text;mso-width-percent:0;mso-width-relative:margin;v-text-anchor:middle" o:gfxdata="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" fillcolor="#5b9bd5 [3204]" strokecolor="#1f4d78 [1604]" strokeweight="1pt">
+              <v:rect w14:anchorId="55ECCE99" id="Rectangle 1" o:spid="_x0000_s1028" style="position:absolute;margin-left:97.15pt;margin-top:97.5pt;width:119.4pt;height:43.2pt;z-index:251659264;visibility:visible;mso-wrap-style:square;mso-width-percent:0;mso-wrap-distance-left:9pt;mso-wrap-distance-top:0;mso-wrap-distance-right:9pt;mso-wrap-distance-bottom:0;mso-position-horizontal:absolute;mso-position-horizontal-relative:text;mso-position-vertical:absolute;mso-position-vertical-relative:text;mso-width-percent:0;mso-width-relative:margin;v-text-anchor:middle" o:gfxdata="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" fillcolor="#5b9bd5 [3204]" strokecolor="#1f4d78 [1604]" strokeweight="1pt">
                 <v:textbox>
                   <w:txbxContent>
                     <w:p>
@@ -2874,7 +2096,7 @@
           </mc:Choice>
           <mc:Fallback>
             <w:pict>
-              <v:rect w14:anchorId="7B751254" id="Rectangle 11" o:spid="_x0000_s1029" style="position:absolute;margin-left:97.2pt;margin-top:.55pt;width:119.4pt;height:43.2pt;z-index:251661312;visibility:visible;mso-wrap-style:square;mso-wrap-distance-left:9pt;mso-wrap-distance-top:0;mso-wrap-distance-right:9pt;mso-wrap-distance-bottom:0;mso-position-horizontal:absolute;mso-position-horizontal-relative:text;mso-position-vertical:absolute;mso-position-vertical-relative:text;v-text-anchor:middle" o:gfxdata="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" fillcolor="#9ecb81 [2169]" strokecolor="#70ad47 [3209]" strokeweight=".5pt">
+              <v:rect w14:anchorId="43035168" id="Rectangle 11" o:spid="_x0000_s1029" style="position:absolute;margin-left:97.2pt;margin-top:.55pt;width:119.4pt;height:43.2pt;z-index:251661312;visibility:visible;mso-wrap-style:square;mso-wrap-distance-left:9pt;mso-wrap-distance-top:0;mso-wrap-distance-right:9pt;mso-wrap-distance-bottom:0;mso-position-horizontal:absolute;mso-position-horizontal-relative:text;mso-position-vertical:absolute;mso-position-vertical-relative:text;v-text-anchor:middle" o:gfxdata="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" fillcolor="#9ecb81 [2169]" strokecolor="#70ad47 [3209]" strokeweight=".5pt">
                 <v:fill color2="#8ac066 [2617]" rotate="t" colors="0 #b5d5a7;.5 #aace99;1 #9cca86" focus="100%" type="gradient">
                   <o:fill v:ext="view" type="gradientUnscaled"/>
                 </v:fill>
@@ -2903,9 +2125,9 @@
       <w:pPr>
         <w:pStyle w:val="Heading1"/>
       </w:pPr>
-      <w:bookmarkStart w:id="85" w:name="_Toc475542646"/>
-      <w:bookmarkStart w:id="86" w:name="_Toc526171876"/>
-      <w:bookmarkEnd w:id="80"/>
+      <w:bookmarkStart w:id="72" w:name="_Toc475542646"/>
+      <w:bookmarkStart w:id="73" w:name="_Toc526171876"/>
+      <w:bookmarkEnd w:id="70"/>
       <w:r>
         <w:lastRenderedPageBreak/>
         <w:t>Running the</w:t>
@@ -2919,20 +2141,15 @@
       <w:r>
         <w:t>xample</w:t>
       </w:r>
-      <w:bookmarkEnd w:id="85"/>
-      <w:bookmarkEnd w:id="86"/>
+      <w:bookmarkEnd w:id="72"/>
+      <w:bookmarkEnd w:id="73"/>
     </w:p>
     <w:p>
       <w:pPr>
         <w:ind w:firstLine="284"/>
       </w:pPr>
-      <w:proofErr w:type="spellStart"/>
-      <w:r>
-        <w:t>QuarchPy</w:t>
-      </w:r>
-      <w:proofErr w:type="spellEnd"/>
-      <w:r>
-        <w:t xml:space="preserve"> </w:t>
+      <w:r>
+        <w:t xml:space="preserve">QuarchPy </w:t>
       </w:r>
       <w:r>
         <w:t>ships with</w:t>
@@ -2969,15 +2186,7 @@
         <w:pStyle w:val="QBulletlist"/>
       </w:pPr>
       <w:r>
-        <w:t xml:space="preserve">For the users familiar with FIO configuration files, </w:t>
-      </w:r>
-      <w:proofErr w:type="spellStart"/>
-      <w:r>
-        <w:t>QuarchPy</w:t>
-      </w:r>
-      <w:proofErr w:type="spellEnd"/>
-      <w:r>
-        <w:t xml:space="preserve"> is able to import all settings from a .</w:t>
+        <w:t>For the users familiar with FIO configuration files, QuarchPy is able to import all settings from a .</w:t>
       </w:r>
       <w:proofErr w:type="spellStart"/>
       <w:r>
@@ -3346,7 +2555,7 @@
                     </pic:cNvPicPr>
                   </pic:nvPicPr>
                   <pic:blipFill>
-                    <a:blip r:embed="rId13" cstate="print">
+                    <a:blip r:embed="rId9" cstate="print">
                       <a:extLst>
                         <a:ext uri="{28A0092B-C50C-407E-A947-70E740481C1C}">
                           <a14:useLocalDpi xmlns:a14="http://schemas.microsoft.com/office/drawing/2010/main" val="0"/>
@@ -3374,8 +2583,8 @@
       </w:r>
     </w:p>
     <w:sectPr>
-      <w:headerReference w:type="default" r:id="rId14"/>
-      <w:footerReference w:type="default" r:id="rId15"/>
+      <w:headerReference w:type="default" r:id="rId10"/>
+      <w:footerReference w:type="default" r:id="rId11"/>
       <w:pgSz w:w="11906" w:h="16838"/>
       <w:pgMar w:top="1440" w:right="1440" w:bottom="1440" w:left="1440" w:header="680" w:footer="283" w:gutter="0"/>
       <w:cols w:space="708"/>
@@ -3386,7 +2595,7 @@
 </file>
 
 <file path=word/endnotes.xml><?xml version="1.0" encoding="utf-8"?>
-<w:endnotes xmlns:wpc="http://schemas.microsoft.com/office/word/2010/wordprocessingCanvas" xmlns:cx="http://schemas.microsoft.com/office/drawing/2014/chartex" xmlns:cx1="http://schemas.microsoft.com/office/drawing/2015/9/8/chartex" xmlns:cx2="http://schemas.microsoft.com/office/drawing/2015/10/21/chartex" xmlns:cx3="http://schemas.microsoft.com/office/drawing/2016/5/9/chartex" xmlns:cx4="http://schemas.microsoft.com/office/drawing/2016/5/10/chartex" xmlns:cx5="http://schemas.microsoft.com/office/drawing/2016/5/11/chartex" xmlns:cx6="http://schemas.microsoft.com/office/drawing/2016/5/12/chartex" xmlns:cx7="http://schemas.microsoft.com/office/drawing/2016/5/13/chartex" xmlns:cx8="http://schemas.microsoft.com/office/drawing/2016/5/14/chartex" xmlns:mc="http://schemas.openxmlformats.org/markup-compatibility/2006" xmlns:aink="http://schemas.microsoft.com/office/drawing/2016/ink" xmlns:am3d="http://schemas.microsoft.com/office/drawing/2017/model3d" xmlns:o="urn:schemas-microsoft-com:office:office" xmlns:r="http://schemas.openxmlformats.org/officeDocument/2006/relationships" xmlns:m="http://schemas.openxmlformats.org/officeDocument/2006/math" xmlns:v="urn:schemas-microsoft-com:vml" xmlns:wp14="http://schemas.microsoft.com/office/word/2010/wordprocessingDrawing" xmlns:wp="http://schemas.openxmlformats.org/drawingml/2006/wordprocessingDrawing" xmlns:w10="urn:schemas-microsoft-com:office:word" xmlns:w="http://schemas.openxmlformats.org/wordprocessingml/2006/main" xmlns:w14="http://schemas.microsoft.com/office/word/2010/wordml" xmlns:w15="http://schemas.microsoft.com/office/word/2012/wordml" xmlns:w16cid="http://schemas.microsoft.com/office/word/2016/wordml/cid" xmlns:w16se="http://schemas.microsoft.com/office/word/2015/wordml/symex" xmlns:wpg="http://schemas.microsoft.com/office/word/2010/wordprocessingGroup" xmlns:wpi="http://schemas.microsoft.com/office/word/2010/wordprocessingInk" xmlns:wne="http://schemas.microsoft.com/office/word/2006/wordml" xmlns:wps="http://schemas.microsoft.com/office/word/2010/wordprocessingShape" mc:Ignorable="w14 w15 w16se w16cid wp14">
+<w:endnotes xmlns:wpc="http://schemas.microsoft.com/office/word/2010/wordprocessingCanvas" xmlns:cx="http://schemas.microsoft.com/office/drawing/2014/chartex" xmlns:cx1="http://schemas.microsoft.com/office/drawing/2015/9/8/chartex" xmlns:cx2="http://schemas.microsoft.com/office/drawing/2015/10/21/chartex" xmlns:cx3="http://schemas.microsoft.com/office/drawing/2016/5/9/chartex" xmlns:cx4="http://schemas.microsoft.com/office/drawing/2016/5/10/chartex" xmlns:cx5="http://schemas.microsoft.com/office/drawing/2016/5/11/chartex" xmlns:cx6="http://schemas.microsoft.com/office/drawing/2016/5/12/chartex" xmlns:cx7="http://schemas.microsoft.com/office/drawing/2016/5/13/chartex" xmlns:cx8="http://schemas.microsoft.com/office/drawing/2016/5/14/chartex" xmlns:mc="http://schemas.openxmlformats.org/markup-compatibility/2006" xmlns:aink="http://schemas.microsoft.com/office/drawing/2016/ink" xmlns:am3d="http://schemas.microsoft.com/office/drawing/2017/model3d" xmlns:o="urn:schemas-microsoft-com:office:office" xmlns:oel="http://schemas.microsoft.com/office/2019/extlst" xmlns:r="http://schemas.openxmlformats.org/officeDocument/2006/relationships" xmlns:m="http://schemas.openxmlformats.org/officeDocument/2006/math" xmlns:v="urn:schemas-microsoft-com:vml" xmlns:wp14="http://schemas.microsoft.com/office/word/2010/wordprocessingDrawing" xmlns:wp="http://schemas.openxmlformats.org/drawingml/2006/wordprocessingDrawing" xmlns:w10="urn:schemas-microsoft-com:office:word" xmlns:w="http://schemas.openxmlformats.org/wordprocessingml/2006/main" xmlns:w14="http://schemas.microsoft.com/office/word/2010/wordml" xmlns:w15="http://schemas.microsoft.com/office/word/2012/wordml" xmlns:w16cex="http://schemas.microsoft.com/office/word/2018/wordml/cex" xmlns:w16cid="http://schemas.microsoft.com/office/word/2016/wordml/cid" xmlns:w16="http://schemas.microsoft.com/office/word/2018/wordml" xmlns:w16sdtdh="http://schemas.microsoft.com/office/word/2020/wordml/sdtdatahash" xmlns:w16se="http://schemas.microsoft.com/office/word/2015/wordml/symex" xmlns:wpg="http://schemas.microsoft.com/office/word/2010/wordprocessingGroup" xmlns:wpi="http://schemas.microsoft.com/office/word/2010/wordprocessingInk" xmlns:wne="http://schemas.microsoft.com/office/word/2006/wordml" xmlns:wps="http://schemas.microsoft.com/office/word/2010/wordprocessingShape" mc:Ignorable="w14 w15 w16se w16cid w16 w16cex w16sdtdh wp14">
   <w:endnote w:type="separator" w:id="-1">
     <w:p>
       <w:r>
@@ -3412,7 +2621,7 @@
 </file>
 
 <file path=word/footer1.xml><?xml version="1.0" encoding="utf-8"?>
-<w:ftr xmlns:wpc="http://schemas.microsoft.com/office/word/2010/wordprocessingCanvas" xmlns:cx="http://schemas.microsoft.com/office/drawing/2014/chartex" xmlns:cx1="http://schemas.microsoft.com/office/drawing/2015/9/8/chartex" xmlns:cx2="http://schemas.microsoft.com/office/drawing/2015/10/21/chartex" xmlns:cx3="http://schemas.microsoft.com/office/drawing/2016/5/9/chartex" xmlns:cx4="http://schemas.microsoft.com/office/drawing/2016/5/10/chartex" xmlns:cx5="http://schemas.microsoft.com/office/drawing/2016/5/11/chartex" xmlns:cx6="http://schemas.microsoft.com/office/drawing/2016/5/12/chartex" xmlns:cx7="http://schemas.microsoft.com/office/drawing/2016/5/13/chartex" xmlns:cx8="http://schemas.microsoft.com/office/drawing/2016/5/14/chartex" xmlns:mc="http://schemas.openxmlformats.org/markup-compatibility/2006" xmlns:aink="http://schemas.microsoft.com/office/drawing/2016/ink" xmlns:am3d="http://schemas.microsoft.com/office/drawing/2017/model3d" xmlns:o="urn:schemas-microsoft-com:office:office" xmlns:r="http://schemas.openxmlformats.org/officeDocument/2006/relationships" xmlns:m="http://schemas.openxmlformats.org/officeDocument/2006/math" xmlns:v="urn:schemas-microsoft-com:vml" xmlns:wp14="http://schemas.microsoft.com/office/word/2010/wordprocessingDrawing" xmlns:wp="http://schemas.openxmlformats.org/drawingml/2006/wordprocessingDrawing" xmlns:w10="urn:schemas-microsoft-com:office:word" xmlns:w="http://schemas.openxmlformats.org/wordprocessingml/2006/main" xmlns:w14="http://schemas.microsoft.com/office/word/2010/wordml" xmlns:w15="http://schemas.microsoft.com/office/word/2012/wordml" xmlns:w16cid="http://schemas.microsoft.com/office/word/2016/wordml/cid" xmlns:w16se="http://schemas.microsoft.com/office/word/2015/wordml/symex" xmlns:wpg="http://schemas.microsoft.com/office/word/2010/wordprocessingGroup" xmlns:wpi="http://schemas.microsoft.com/office/word/2010/wordprocessingInk" xmlns:wne="http://schemas.microsoft.com/office/word/2006/wordml" xmlns:wps="http://schemas.microsoft.com/office/word/2010/wordprocessingShape" mc:Ignorable="w14 w15 w16se w16cid wp14">
+<w:ftr xmlns:wpc="http://schemas.microsoft.com/office/word/2010/wordprocessingCanvas" xmlns:cx="http://schemas.microsoft.com/office/drawing/2014/chartex" xmlns:cx1="http://schemas.microsoft.com/office/drawing/2015/9/8/chartex" xmlns:cx2="http://schemas.microsoft.com/office/drawing/2015/10/21/chartex" xmlns:cx3="http://schemas.microsoft.com/office/drawing/2016/5/9/chartex" xmlns:cx4="http://schemas.microsoft.com/office/drawing/2016/5/10/chartex" xmlns:cx5="http://schemas.microsoft.com/office/drawing/2016/5/11/chartex" xmlns:cx6="http://schemas.microsoft.com/office/drawing/2016/5/12/chartex" xmlns:cx7="http://schemas.microsoft.com/office/drawing/2016/5/13/chartex" xmlns:cx8="http://schemas.microsoft.com/office/drawing/2016/5/14/chartex" xmlns:mc="http://schemas.openxmlformats.org/markup-compatibility/2006" xmlns:aink="http://schemas.microsoft.com/office/drawing/2016/ink" xmlns:am3d="http://schemas.microsoft.com/office/drawing/2017/model3d" xmlns:o="urn:schemas-microsoft-com:office:office" xmlns:oel="http://schemas.microsoft.com/office/2019/extlst" xmlns:r="http://schemas.openxmlformats.org/officeDocument/2006/relationships" xmlns:m="http://schemas.openxmlformats.org/officeDocument/2006/math" xmlns:v="urn:schemas-microsoft-com:vml" xmlns:wp14="http://schemas.microsoft.com/office/word/2010/wordprocessingDrawing" xmlns:wp="http://schemas.openxmlformats.org/drawingml/2006/wordprocessingDrawing" xmlns:w10="urn:schemas-microsoft-com:office:word" xmlns:w="http://schemas.openxmlformats.org/wordprocessingml/2006/main" xmlns:w14="http://schemas.microsoft.com/office/word/2010/wordml" xmlns:w15="http://schemas.microsoft.com/office/word/2012/wordml" xmlns:w16cex="http://schemas.microsoft.com/office/word/2018/wordml/cex" xmlns:w16cid="http://schemas.microsoft.com/office/word/2016/wordml/cid" xmlns:w16="http://schemas.microsoft.com/office/word/2018/wordml" xmlns:w16sdtdh="http://schemas.microsoft.com/office/word/2020/wordml/sdtdatahash" xmlns:w16se="http://schemas.microsoft.com/office/word/2015/wordml/symex" xmlns:wpg="http://schemas.microsoft.com/office/word/2010/wordprocessingGroup" xmlns:wpi="http://schemas.microsoft.com/office/word/2010/wordprocessingInk" xmlns:wne="http://schemas.microsoft.com/office/word/2006/wordml" xmlns:wps="http://schemas.microsoft.com/office/word/2010/wordprocessingShape" mc:Ignorable="w14 w15 w16se w16cid w16 w16cex w16sdtdh wp14">
   <w:p>
     <w:pPr>
       <w:pStyle w:val="Footer"/>
@@ -3423,7 +2632,7 @@
     <w:r>
       <w:t>3</w:t>
     </w:r>
-    <w:del w:id="87" w:author="Comparison" w:date="2019-05-09T12:34:00Z">
+    <w:del w:id="74" w:author="Comparison" w:date="2019-05-09T12:34:00Z">
       <w:r>
         <w:delText>0</w:delText>
       </w:r>
@@ -3503,7 +2712,7 @@
 </file>
 
 <file path=word/footnotes.xml><?xml version="1.0" encoding="utf-8"?>
-<w:footnotes xmlns:wpc="http://schemas.microsoft.com/office/word/2010/wordprocessingCanvas" xmlns:cx="http://schemas.microsoft.com/office/drawing/2014/chartex" xmlns:cx1="http://schemas.microsoft.com/office/drawing/2015/9/8/chartex" xmlns:cx2="http://schemas.microsoft.com/office/drawing/2015/10/21/chartex" xmlns:cx3="http://schemas.microsoft.com/office/drawing/2016/5/9/chartex" xmlns:cx4="http://schemas.microsoft.com/office/drawing/2016/5/10/chartex" xmlns:cx5="http://schemas.microsoft.com/office/drawing/2016/5/11/chartex" xmlns:cx6="http://schemas.microsoft.com/office/drawing/2016/5/12/chartex" xmlns:cx7="http://schemas.microsoft.com/office/drawing/2016/5/13/chartex" xmlns:cx8="http://schemas.microsoft.com/office/drawing/2016/5/14/chartex" xmlns:mc="http://schemas.openxmlformats.org/markup-compatibility/2006" xmlns:aink="http://schemas.microsoft.com/office/drawing/2016/ink" xmlns:am3d="http://schemas.microsoft.com/office/drawing/2017/model3d" xmlns:o="urn:schemas-microsoft-com:office:office" xmlns:r="http://schemas.openxmlformats.org/officeDocument/2006/relationships" xmlns:m="http://schemas.openxmlformats.org/officeDocument/2006/math" xmlns:v="urn:schemas-microsoft-com:vml" xmlns:wp14="http://schemas.microsoft.com/office/word/2010/wordprocessingDrawing" xmlns:wp="http://schemas.openxmlformats.org/drawingml/2006/wordprocessingDrawing" xmlns:w10="urn:schemas-microsoft-com:office:word" xmlns:w="http://schemas.openxmlformats.org/wordprocessingml/2006/main" xmlns:w14="http://schemas.microsoft.com/office/word/2010/wordml" xmlns:w15="http://schemas.microsoft.com/office/word/2012/wordml" xmlns:w16cid="http://schemas.microsoft.com/office/word/2016/wordml/cid" xmlns:w16se="http://schemas.microsoft.com/office/word/2015/wordml/symex" xmlns:wpg="http://schemas.microsoft.com/office/word/2010/wordprocessingGroup" xmlns:wpi="http://schemas.microsoft.com/office/word/2010/wordprocessingInk" xmlns:wne="http://schemas.microsoft.com/office/word/2006/wordml" xmlns:wps="http://schemas.microsoft.com/office/word/2010/wordprocessingShape" mc:Ignorable="w14 w15 w16se w16cid wp14">
+<w:footnotes xmlns:wpc="http://schemas.microsoft.com/office/word/2010/wordprocessingCanvas" xmlns:cx="http://schemas.microsoft.com/office/drawing/2014/chartex" xmlns:cx1="http://schemas.microsoft.com/office/drawing/2015/9/8/chartex" xmlns:cx2="http://schemas.microsoft.com/office/drawing/2015/10/21/chartex" xmlns:cx3="http://schemas.microsoft.com/office/drawing/2016/5/9/chartex" xmlns:cx4="http://schemas.microsoft.com/office/drawing/2016/5/10/chartex" xmlns:cx5="http://schemas.microsoft.com/office/drawing/2016/5/11/chartex" xmlns:cx6="http://schemas.microsoft.com/office/drawing/2016/5/12/chartex" xmlns:cx7="http://schemas.microsoft.com/office/drawing/2016/5/13/chartex" xmlns:cx8="http://schemas.microsoft.com/office/drawing/2016/5/14/chartex" xmlns:mc="http://schemas.openxmlformats.org/markup-compatibility/2006" xmlns:aink="http://schemas.microsoft.com/office/drawing/2016/ink" xmlns:am3d="http://schemas.microsoft.com/office/drawing/2017/model3d" xmlns:o="urn:schemas-microsoft-com:office:office" xmlns:oel="http://schemas.microsoft.com/office/2019/extlst" xmlns:r="http://schemas.openxmlformats.org/officeDocument/2006/relationships" xmlns:m="http://schemas.openxmlformats.org/officeDocument/2006/math" xmlns:v="urn:schemas-microsoft-com:vml" xmlns:wp14="http://schemas.microsoft.com/office/word/2010/wordprocessingDrawing" xmlns:wp="http://schemas.openxmlformats.org/drawingml/2006/wordprocessingDrawing" xmlns:w10="urn:schemas-microsoft-com:office:word" xmlns:w="http://schemas.openxmlformats.org/wordprocessingml/2006/main" xmlns:w14="http://schemas.microsoft.com/office/word/2010/wordml" xmlns:w15="http://schemas.microsoft.com/office/word/2012/wordml" xmlns:w16cex="http://schemas.microsoft.com/office/word/2018/wordml/cex" xmlns:w16cid="http://schemas.microsoft.com/office/word/2016/wordml/cid" xmlns:w16="http://schemas.microsoft.com/office/word/2018/wordml" xmlns:w16sdtdh="http://schemas.microsoft.com/office/word/2020/wordml/sdtdatahash" xmlns:w16se="http://schemas.microsoft.com/office/word/2015/wordml/symex" xmlns:wpg="http://schemas.microsoft.com/office/word/2010/wordprocessingGroup" xmlns:wpi="http://schemas.microsoft.com/office/word/2010/wordprocessingInk" xmlns:wne="http://schemas.microsoft.com/office/word/2006/wordml" xmlns:wps="http://schemas.microsoft.com/office/word/2010/wordprocessingShape" mc:Ignorable="w14 w15 w16se w16cid w16 w16cex w16sdtdh wp14">
   <w:footnote w:type="separator" w:id="-1">
     <w:p>
       <w:r>
@@ -3529,7 +2738,7 @@
 </file>
 
 <file path=word/header1.xml><?xml version="1.0" encoding="utf-8"?>
-<w:hdr xmlns:wpc="http://schemas.microsoft.com/office/word/2010/wordprocessingCanvas" xmlns:cx="http://schemas.microsoft.com/office/drawing/2014/chartex" xmlns:cx1="http://schemas.microsoft.com/office/drawing/2015/9/8/chartex" xmlns:cx2="http://schemas.microsoft.com/office/drawing/2015/10/21/chartex" xmlns:cx3="http://schemas.microsoft.com/office/drawing/2016/5/9/chartex" xmlns:cx4="http://schemas.microsoft.com/office/drawing/2016/5/10/chartex" xmlns:cx5="http://schemas.microsoft.com/office/drawing/2016/5/11/chartex" xmlns:cx6="http://schemas.microsoft.com/office/drawing/2016/5/12/chartex" xmlns:cx7="http://schemas.microsoft.com/office/drawing/2016/5/13/chartex" xmlns:cx8="http://schemas.microsoft.com/office/drawing/2016/5/14/chartex" xmlns:mc="http://schemas.openxmlformats.org/markup-compatibility/2006" xmlns:aink="http://schemas.microsoft.com/office/drawing/2016/ink" xmlns:am3d="http://schemas.microsoft.com/office/drawing/2017/model3d" xmlns:o="urn:schemas-microsoft-com:office:office" xmlns:r="http://schemas.openxmlformats.org/officeDocument/2006/relationships" xmlns:m="http://schemas.openxmlformats.org/officeDocument/2006/math" xmlns:v="urn:schemas-microsoft-com:vml" xmlns:wp14="http://schemas.microsoft.com/office/word/2010/wordprocessingDrawing" xmlns:wp="http://schemas.openxmlformats.org/drawingml/2006/wordprocessingDrawing" xmlns:w10="urn:schemas-microsoft-com:office:word" xmlns:w="http://schemas.openxmlformats.org/wordprocessingml/2006/main" xmlns:w14="http://schemas.microsoft.com/office/word/2010/wordml" xmlns:w15="http://schemas.microsoft.com/office/word/2012/wordml" xmlns:w16cid="http://schemas.microsoft.com/office/word/2016/wordml/cid" xmlns:w16se="http://schemas.microsoft.com/office/word/2015/wordml/symex" xmlns:wpg="http://schemas.microsoft.com/office/word/2010/wordprocessingGroup" xmlns:wpi="http://schemas.microsoft.com/office/word/2010/wordprocessingInk" xmlns:wne="http://schemas.microsoft.com/office/word/2006/wordml" xmlns:wps="http://schemas.microsoft.com/office/word/2010/wordprocessingShape" mc:Ignorable="w14 w15 w16se w16cid wp14">
+<w:hdr xmlns:wpc="http://schemas.microsoft.com/office/word/2010/wordprocessingCanvas" xmlns:cx="http://schemas.microsoft.com/office/drawing/2014/chartex" xmlns:cx1="http://schemas.microsoft.com/office/drawing/2015/9/8/chartex" xmlns:cx2="http://schemas.microsoft.com/office/drawing/2015/10/21/chartex" xmlns:cx3="http://schemas.microsoft.com/office/drawing/2016/5/9/chartex" xmlns:cx4="http://schemas.microsoft.com/office/drawing/2016/5/10/chartex" xmlns:cx5="http://schemas.microsoft.com/office/drawing/2016/5/11/chartex" xmlns:cx6="http://schemas.microsoft.com/office/drawing/2016/5/12/chartex" xmlns:cx7="http://schemas.microsoft.com/office/drawing/2016/5/13/chartex" xmlns:cx8="http://schemas.microsoft.com/office/drawing/2016/5/14/chartex" xmlns:mc="http://schemas.openxmlformats.org/markup-compatibility/2006" xmlns:aink="http://schemas.microsoft.com/office/drawing/2016/ink" xmlns:am3d="http://schemas.microsoft.com/office/drawing/2017/model3d" xmlns:o="urn:schemas-microsoft-com:office:office" xmlns:oel="http://schemas.microsoft.com/office/2019/extlst" xmlns:r="http://schemas.openxmlformats.org/officeDocument/2006/relationships" xmlns:m="http://schemas.openxmlformats.org/officeDocument/2006/math" xmlns:v="urn:schemas-microsoft-com:vml" xmlns:wp14="http://schemas.microsoft.com/office/word/2010/wordprocessingDrawing" xmlns:wp="http://schemas.openxmlformats.org/drawingml/2006/wordprocessingDrawing" xmlns:w10="urn:schemas-microsoft-com:office:word" xmlns:w="http://schemas.openxmlformats.org/wordprocessingml/2006/main" xmlns:w14="http://schemas.microsoft.com/office/word/2010/wordml" xmlns:w15="http://schemas.microsoft.com/office/word/2012/wordml" xmlns:w16cex="http://schemas.microsoft.com/office/word/2018/wordml/cex" xmlns:w16cid="http://schemas.microsoft.com/office/word/2016/wordml/cid" xmlns:w16="http://schemas.microsoft.com/office/word/2018/wordml" xmlns:w16sdtdh="http://schemas.microsoft.com/office/word/2020/wordml/sdtdatahash" xmlns:w16se="http://schemas.microsoft.com/office/word/2015/wordml/symex" xmlns:wpg="http://schemas.microsoft.com/office/word/2010/wordprocessingGroup" xmlns:wpi="http://schemas.microsoft.com/office/word/2010/wordprocessingInk" xmlns:wne="http://schemas.microsoft.com/office/word/2006/wordml" xmlns:wps="http://schemas.microsoft.com/office/word/2010/wordprocessingShape" mc:Ignorable="w14 w15 w16se w16cid w16 w16cex w16sdtdh wp14">
   <w:p>
     <w:pPr>
       <w:pStyle w:val="Header"/>
@@ -3628,7 +2837,7 @@
 </file>
 
 <file path=word/numbering.xml><?xml version="1.0" encoding="utf-8"?>
-<w:numbering xmlns:wpc="http://schemas.microsoft.com/office/word/2010/wordprocessingCanvas" xmlns:cx="http://schemas.microsoft.com/office/drawing/2014/chartex" xmlns:cx1="http://schemas.microsoft.com/office/drawing/2015/9/8/chartex" xmlns:cx2="http://schemas.microsoft.com/office/drawing/2015/10/21/chartex" xmlns:cx3="http://schemas.microsoft.com/office/drawing/2016/5/9/chartex" xmlns:cx4="http://schemas.microsoft.com/office/drawing/2016/5/10/chartex" xmlns:cx5="http://schemas.microsoft.com/office/drawing/2016/5/11/chartex" xmlns:cx6="http://schemas.microsoft.com/office/drawing/2016/5/12/chartex" xmlns:cx7="http://schemas.microsoft.com/office/drawing/2016/5/13/chartex" xmlns:cx8="http://schemas.microsoft.com/office/drawing/2016/5/14/chartex" xmlns:mc="http://schemas.openxmlformats.org/markup-compatibility/2006" xmlns:aink="http://schemas.microsoft.com/office/drawing/2016/ink" xmlns:am3d="http://schemas.microsoft.com/office/drawing/2017/model3d" xmlns:o="urn:schemas-microsoft-com:office:office" xmlns:r="http://schemas.openxmlformats.org/officeDocument/2006/relationships" xmlns:m="http://schemas.openxmlformats.org/officeDocument/2006/math" xmlns:v="urn:schemas-microsoft-com:vml" xmlns:wp14="http://schemas.microsoft.com/office/word/2010/wordprocessingDrawing" xmlns:wp="http://schemas.openxmlformats.org/drawingml/2006/wordprocessingDrawing" xmlns:w10="urn:schemas-microsoft-com:office:word" xmlns:w="http://schemas.openxmlformats.org/wordprocessingml/2006/main" xmlns:w14="http://schemas.microsoft.com/office/word/2010/wordml" xmlns:w15="http://schemas.microsoft.com/office/word/2012/wordml" xmlns:w16cid="http://schemas.microsoft.com/office/word/2016/wordml/cid" xmlns:w16se="http://schemas.microsoft.com/office/word/2015/wordml/symex" xmlns:wpg="http://schemas.microsoft.com/office/word/2010/wordprocessingGroup" xmlns:wpi="http://schemas.microsoft.com/office/word/2010/wordprocessingInk" xmlns:wne="http://schemas.microsoft.com/office/word/2006/wordml" xmlns:wps="http://schemas.microsoft.com/office/word/2010/wordprocessingShape" mc:Ignorable="w14 w15 w16se w16cid wp14">
+<w:numbering xmlns:wpc="http://schemas.microsoft.com/office/word/2010/wordprocessingCanvas" xmlns:cx="http://schemas.microsoft.com/office/drawing/2014/chartex" xmlns:cx1="http://schemas.microsoft.com/office/drawing/2015/9/8/chartex" xmlns:cx2="http://schemas.microsoft.com/office/drawing/2015/10/21/chartex" xmlns:cx3="http://schemas.microsoft.com/office/drawing/2016/5/9/chartex" xmlns:cx4="http://schemas.microsoft.com/office/drawing/2016/5/10/chartex" xmlns:cx5="http://schemas.microsoft.com/office/drawing/2016/5/11/chartex" xmlns:cx6="http://schemas.microsoft.com/office/drawing/2016/5/12/chartex" xmlns:cx7="http://schemas.microsoft.com/office/drawing/2016/5/13/chartex" xmlns:cx8="http://schemas.microsoft.com/office/drawing/2016/5/14/chartex" xmlns:mc="http://schemas.openxmlformats.org/markup-compatibility/2006" xmlns:aink="http://schemas.microsoft.com/office/drawing/2016/ink" xmlns:am3d="http://schemas.microsoft.com/office/drawing/2017/model3d" xmlns:o="urn:schemas-microsoft-com:office:office" xmlns:oel="http://schemas.microsoft.com/office/2019/extlst" xmlns:r="http://schemas.openxmlformats.org/officeDocument/2006/relationships" xmlns:m="http://schemas.openxmlformats.org/officeDocument/2006/math" xmlns:v="urn:schemas-microsoft-com:vml" xmlns:wp14="http://schemas.microsoft.com/office/word/2010/wordprocessingDrawing" xmlns:wp="http://schemas.openxmlformats.org/drawingml/2006/wordprocessingDrawing" xmlns:w10="urn:schemas-microsoft-com:office:word" xmlns:w="http://schemas.openxmlformats.org/wordprocessingml/2006/main" xmlns:w14="http://schemas.microsoft.com/office/word/2010/wordml" xmlns:w15="http://schemas.microsoft.com/office/word/2012/wordml" xmlns:w16cex="http://schemas.microsoft.com/office/word/2018/wordml/cex" xmlns:w16cid="http://schemas.microsoft.com/office/word/2016/wordml/cid" xmlns:w16="http://schemas.microsoft.com/office/word/2018/wordml" xmlns:w16sdtdh="http://schemas.microsoft.com/office/word/2020/wordml/sdtdatahash" xmlns:w16se="http://schemas.microsoft.com/office/word/2015/wordml/symex" xmlns:wpg="http://schemas.microsoft.com/office/word/2010/wordprocessingGroup" xmlns:wpi="http://schemas.microsoft.com/office/word/2010/wordprocessingInk" xmlns:wne="http://schemas.microsoft.com/office/word/2006/wordml" xmlns:wps="http://schemas.microsoft.com/office/word/2010/wordprocessingShape" mc:Ignorable="w14 w15 w16se w16cid w16 w16cex w16sdtdh wp14">
   <w:abstractNum w:abstractNumId="0" w15:restartNumberingAfterBreak="0">
     <w:nsid w:val="462B2F0B"/>
     <w:multiLevelType w:val="multilevel"/>
@@ -4336,19 +3545,19 @@
       </w:rPr>
     </w:lvl>
   </w:abstractNum>
-  <w:num w:numId="1">
+  <w:num w:numId="1" w16cid:durableId="61873592">
     <w:abstractNumId w:val="3"/>
   </w:num>
-  <w:num w:numId="2">
+  <w:num w:numId="2" w16cid:durableId="1177885035">
     <w:abstractNumId w:val="2"/>
   </w:num>
-  <w:num w:numId="3">
+  <w:num w:numId="3" w16cid:durableId="1809130687">
     <w:abstractNumId w:val="1"/>
   </w:num>
-  <w:num w:numId="4">
+  <w:num w:numId="4" w16cid:durableId="1847360855">
     <w:abstractNumId w:val="0"/>
   </w:num>
-  <w:num w:numId="5">
+  <w:num w:numId="5" w16cid:durableId="376123639">
     <w:abstractNumId w:val="0"/>
     <w:lvlOverride w:ilvl="0">
       <w:startOverride w:val="1"/>
@@ -4378,10 +3587,10 @@
       <w:startOverride w:val="1"/>
     </w:lvlOverride>
   </w:num>
-  <w:num w:numId="6">
+  <w:num w:numId="6" w16cid:durableId="771048156">
     <w:abstractNumId w:val="5"/>
   </w:num>
-  <w:num w:numId="7">
+  <w:num w:numId="7" w16cid:durableId="1231380614">
     <w:abstractNumId w:val="4"/>
   </w:num>
   <w:numIdMacAtCleanup w:val="5"/>
@@ -4389,7 +3598,7 @@
 </file>
 
 <file path=word/styles.xml><?xml version="1.0" encoding="utf-8"?>
-<w:styles xmlns:mc="http://schemas.openxmlformats.org/markup-compatibility/2006" xmlns:r="http://schemas.openxmlformats.org/officeDocument/2006/relationships" xmlns:w="http://schemas.openxmlformats.org/wordprocessingml/2006/main" xmlns:w14="http://schemas.microsoft.com/office/word/2010/wordml" xmlns:w15="http://schemas.microsoft.com/office/word/2012/wordml" xmlns:w16cid="http://schemas.microsoft.com/office/word/2016/wordml/cid" xmlns:w16se="http://schemas.microsoft.com/office/word/2015/wordml/symex" mc:Ignorable="w14 w15 w16se w16cid">
+<w:styles xmlns:mc="http://schemas.openxmlformats.org/markup-compatibility/2006" xmlns:r="http://schemas.openxmlformats.org/officeDocument/2006/relationships" xmlns:w="http://schemas.openxmlformats.org/wordprocessingml/2006/main" xmlns:w14="http://schemas.microsoft.com/office/word/2010/wordml" xmlns:w15="http://schemas.microsoft.com/office/word/2012/wordml" xmlns:w16cex="http://schemas.microsoft.com/office/word/2018/wordml/cex" xmlns:w16cid="http://schemas.microsoft.com/office/word/2016/wordml/cid" xmlns:w16="http://schemas.microsoft.com/office/word/2018/wordml" xmlns:w16sdtdh="http://schemas.microsoft.com/office/word/2020/wordml/sdtdatahash" xmlns:w16se="http://schemas.microsoft.com/office/word/2015/wordml/symex" mc:Ignorable="w14 w15 w16se w16cid w16 w16cex w16sdtdh">
   <w:docDefaults>
     <w:rPrDefault>
       <w:rPr>

</xml_diff>